<commit_message>
Retient provisoirement le HYDROSONIC dans le comparatif matériel
Ajoute en fin de comparatif le choix retenu pour le moment : le B-meters
HYDROSONIC, compteur ultrasonique à radio LoRaWAN intégrée. C'est le seul
compteur de la marque proposée par Wi6Labs qui voit une fuite de chasse
d'eau, avec des données non chiffrées et un seul appareil par point. Le
Diehl HYDRUS 2.0 est indiqué en second choix.

La sélection est marquée provisoire : un devis en version LoRaWAN et R500
reste à demander, et le choix sera confirmé par le diagnostic du plombier.

Co-Authored-By: Claude Opus 5.5 <noreply@anthropic.com>
Claude-Session: https://claude.ai/code/session_01DGGfCD6qThzdifW5Zpbw8C
</commit_message>
<xml_diff>
--- a/docs/Comparatif-materiel.docx
+++ b/docs/Comparatif-materiel.docx
@@ -661,7 +661,7 @@
               <w:keepNext/>
               <w:spacing w:after="0" w:line="222"/>
             </w:pPr>
-            <w:hyperlink w:history="1" r:id="rIdbd8pllges5qjuxlrnzq9l">
+            <w:hyperlink w:history="1" r:id="rIdzodb3pr63kxrqbee1be-5">
               <w:r>
                 <w:rPr>
                   <w:rFonts w:ascii="Calibri" w:cs="Calibri" w:eastAsia="Calibri" w:hAnsi="Calibri"/>
@@ -682,7 +682,7 @@
               </w:rPr>
               <w:t xml:space="preserve">  ·  </w:t>
             </w:r>
-            <w:hyperlink w:history="1" r:id="rIdk3aigkyvyi-4tlc8tgh59">
+            <w:hyperlink w:history="1" r:id="rIdqw2gmm9dine_ofsnp4mcv">
               <w:r>
                 <w:rPr>
                   <w:rFonts w:ascii="Calibri" w:cs="Calibri" w:eastAsia="Calibri" w:hAnsi="Calibri"/>
@@ -1000,7 +1000,7 @@
               <w:keepNext/>
               <w:spacing w:after="0" w:line="222"/>
             </w:pPr>
-            <w:hyperlink w:history="1" r:id="rIdikmlr3haz0o4z-he4lyrk">
+            <w:hyperlink w:history="1" r:id="rIdt42s4anrtnk0be7okylx3">
               <w:r>
                 <w:rPr>
                   <w:rFonts w:ascii="Calibri" w:cs="Calibri" w:eastAsia="Calibri" w:hAnsi="Calibri"/>
@@ -1021,7 +1021,7 @@
               </w:rPr>
               <w:t xml:space="preserve">  ·  </w:t>
             </w:r>
-            <w:hyperlink w:history="1" r:id="rIdhbdho3rspiwqhwcxlvowh">
+            <w:hyperlink w:history="1" r:id="rIdz0lsb6l9p_aivkq-jmhmo">
               <w:r>
                 <w:rPr>
                   <w:rFonts w:ascii="Calibri" w:cs="Calibri" w:eastAsia="Calibri" w:hAnsi="Calibri"/>
@@ -1313,7 +1313,7 @@
               <w:keepNext/>
               <w:spacing w:after="0" w:line="222"/>
             </w:pPr>
-            <w:hyperlink w:history="1" r:id="rId-j_bss0brlnctelncruar">
+            <w:hyperlink w:history="1" r:id="rIdqcqegv16w7shgwyosix8n">
               <w:r>
                 <w:rPr>
                   <w:rFonts w:ascii="Calibri" w:cs="Calibri" w:eastAsia="Calibri" w:hAnsi="Calibri"/>
@@ -1631,7 +1631,7 @@
               <w:keepNext/>
               <w:spacing w:after="0" w:line="222"/>
             </w:pPr>
-            <w:hyperlink w:history="1" r:id="rIdbxbm644xfxjyvwyrxtgya">
+            <w:hyperlink w:history="1" r:id="rIdbqdszqugnflznkrrxfuz1">
               <w:r>
                 <w:rPr>
                   <w:rFonts w:ascii="Calibri" w:cs="Calibri" w:eastAsia="Calibri" w:hAnsi="Calibri"/>
@@ -1652,7 +1652,7 @@
               </w:rPr>
               <w:t xml:space="preserve">  ·  </w:t>
             </w:r>
-            <w:hyperlink w:history="1" r:id="rIdxe8c1grgjnwzecufhwtak">
+            <w:hyperlink w:history="1" r:id="rIdvgviz2vjt8bhpsb2-nroo">
               <w:r>
                 <w:rPr>
                   <w:rFonts w:ascii="Calibri" w:cs="Calibri" w:eastAsia="Calibri" w:hAnsi="Calibri"/>
@@ -1978,7 +1978,7 @@
               <w:keepNext/>
               <w:spacing w:after="0" w:line="222"/>
             </w:pPr>
-            <w:hyperlink w:history="1" r:id="rIdyd-huuhuzakfbqqfa6rln">
+            <w:hyperlink w:history="1" r:id="rIdcw8t-1phadpoleulf3tyf">
               <w:r>
                 <w:rPr>
                   <w:rFonts w:ascii="Calibri" w:cs="Calibri" w:eastAsia="Calibri" w:hAnsi="Calibri"/>
@@ -2279,7 +2279,7 @@
               <w:keepNext/>
               <w:spacing w:after="0" w:line="222"/>
             </w:pPr>
-            <w:hyperlink w:history="1" r:id="rId9mryfjvgddzoucdoxqyxy">
+            <w:hyperlink w:history="1" r:id="rIddi-lznsrx2l71e2agwnmc">
               <w:r>
                 <w:rPr>
                   <w:rFonts w:ascii="Calibri" w:cs="Calibri" w:eastAsia="Calibri" w:hAnsi="Calibri"/>
@@ -2300,7 +2300,7 @@
               </w:rPr>
               <w:t xml:space="preserve">  ·  </w:t>
             </w:r>
-            <w:hyperlink w:history="1" r:id="rIduwhiwb-qqgp1cbb50erzg">
+            <w:hyperlink w:history="1" r:id="rId97osirqq0jxtfuzscafmx">
               <w:r>
                 <w:rPr>
                   <w:rFonts w:ascii="Calibri" w:cs="Calibri" w:eastAsia="Calibri" w:hAnsi="Calibri"/>
@@ -2716,7 +2716,7 @@
               <w:keepNext/>
               <w:spacing w:after="0" w:line="222"/>
             </w:pPr>
-            <w:hyperlink w:history="1" r:id="rIdh-crxr6tbe0tjbqz_eijj">
+            <w:hyperlink w:history="1" r:id="rIdl5iutas4ghhx9akwqaqs1">
               <w:r>
                 <w:rPr>
                   <w:rFonts w:ascii="Calibri" w:cs="Calibri" w:eastAsia="Calibri" w:hAnsi="Calibri"/>
@@ -2896,7 +2896,7 @@
               <w:keepNext/>
               <w:spacing w:after="0" w:line="222"/>
             </w:pPr>
-            <w:hyperlink w:history="1" r:id="rIdxsnvk7h5mvjto2uyai6_t">
+            <w:hyperlink w:history="1" r:id="rId7k64tfqv6xdyziivv3snk">
               <w:r>
                 <w:rPr>
                   <w:rFonts w:ascii="Calibri" w:cs="Calibri" w:eastAsia="Calibri" w:hAnsi="Calibri"/>
@@ -2917,7 +2917,7 @@
               </w:rPr>
               <w:t xml:space="preserve">  ·  </w:t>
             </w:r>
-            <w:hyperlink w:history="1" r:id="rIdkjazg_yipj89kemsdt-2s">
+            <w:hyperlink w:history="1" r:id="rIdjt3i0sngqd2z3en7okpjn">
               <w:r>
                 <w:rPr>
                   <w:rFonts w:ascii="Calibri" w:cs="Calibri" w:eastAsia="Calibri" w:hAnsi="Calibri"/>
@@ -3091,7 +3091,7 @@
               <w:keepNext/>
               <w:spacing w:after="0" w:line="222"/>
             </w:pPr>
-            <w:hyperlink w:history="1" r:id="rIdpzkeyj6ygoeu2w-q4f3rb">
+            <w:hyperlink w:history="1" r:id="rIdfl8gq6lhnrqktfv9lctqd">
               <w:r>
                 <w:rPr>
                   <w:rFonts w:ascii="Calibri" w:cs="Calibri" w:eastAsia="Calibri" w:hAnsi="Calibri"/>
@@ -3271,7 +3271,7 @@
               <w:keepNext/>
               <w:spacing w:after="0" w:line="222"/>
             </w:pPr>
-            <w:hyperlink w:history="1" r:id="rId1kkozrqlkgja3alyyrd9y">
+            <w:hyperlink w:history="1" r:id="rId-utkxnrtlrbfa59wbqypc">
               <w:r>
                 <w:rPr>
                   <w:rFonts w:ascii="Calibri" w:cs="Calibri" w:eastAsia="Calibri" w:hAnsi="Calibri"/>
@@ -3402,6 +3402,110 @@
           <w:szCs w:val="17"/>
         </w:rPr>
         <w:t xml:space="preserve">est la seule option qui supprime la vidange. Trois vérifications avant de le retenir : le matériau et le diamètre réels des tubes en sous-plafond, le débit de pointe de chaque zone, qui doit rester sous 3 125 L/h, et la dépendance à la plateforme du fabricant pour la détection des petites fuites.</w:t>
+      </w:r>
+    </w:p>
+    <w:p>
+      <w:pPr>
+        <w:keepNext/>
+        <w:spacing w:after="80" w:before="160"/>
+      </w:pPr>
+      <w:r>
+        <w:rPr>
+          <w:rFonts w:ascii="Calibri" w:cs="Calibri" w:eastAsia="Calibri" w:hAnsi="Calibri"/>
+          <w:b/>
+          <w:bCs/>
+          <w:color w:val="0B5563"/>
+          <w:sz w:val="22"/>
+          <w:szCs w:val="22"/>
+        </w:rPr>
+        <w:t xml:space="preserve">4.  Choix retenu pour le moment</w:t>
+      </w:r>
+    </w:p>
+    <w:p>
+      <w:pPr>
+        <w:spacing w:after="60" w:line="240"/>
+      </w:pPr>
+      <w:r>
+        <w:rPr>
+          <w:rFonts w:ascii="Calibri" w:cs="Calibri" w:eastAsia="Calibri" w:hAnsi="Calibri"/>
+          <w:b/>
+          <w:bCs/>
+          <w:color w:val="1F2933"/>
+          <w:sz w:val="17"/>
+          <w:szCs w:val="17"/>
+        </w:rPr>
+        <w:t xml:space="preserve">Compteur sélectionné : B-meters HYDROSONIC, </w:t>
+      </w:r>
+      <w:r>
+        <w:rPr>
+          <w:rFonts w:ascii="Calibri" w:cs="Calibri" w:eastAsia="Calibri" w:hAnsi="Calibri"/>
+          <w:color w:val="1F2933"/>
+          <w:sz w:val="17"/>
+          <w:szCs w:val="17"/>
+        </w:rPr>
+        <w:t xml:space="preserve">ultrasonique à radio LoRaWAN intégrée, R400 en standard et R500 sur demande, DN15 à DN40, pile de 13 ans, décodeur fourni par B-meters. </w:t>
+      </w:r>
+      <w:hyperlink w:history="1" r:id="rIdupd358x9ntbeojyard1t7">
+        <w:r>
+          <w:rPr>
+            <w:rFonts w:ascii="Calibri" w:cs="Calibri" w:eastAsia="Calibri" w:hAnsi="Calibri"/>
+            <w:color w:val="0B5563"/>
+            <w:sz w:val="15"/>
+            <w:szCs w:val="15"/>
+            <w:u w:val="single"/>
+          </w:rPr>
+          <w:t xml:space="preserve">Fiche produit</w:t>
+        </w:r>
+      </w:hyperlink>
+    </w:p>
+    <w:p>
+      <w:pPr>
+        <w:spacing w:after="60" w:line="240"/>
+      </w:pPr>
+      <w:r>
+        <w:rPr>
+          <w:rFonts w:ascii="Calibri" w:cs="Calibri" w:eastAsia="Calibri" w:hAnsi="Calibri"/>
+          <w:b/>
+          <w:bCs/>
+          <w:color w:val="1F2933"/>
+          <w:sz w:val="17"/>
+          <w:szCs w:val="17"/>
+        </w:rPr>
+        <w:t xml:space="preserve">Pourquoi. </w:t>
+      </w:r>
+      <w:r>
+        <w:rPr>
+          <w:rFonts w:ascii="Calibri" w:cs="Calibri" w:eastAsia="Calibri" w:hAnsi="Calibri"/>
+          <w:color w:val="1F2933"/>
+          <w:sz w:val="17"/>
+          <w:szCs w:val="17"/>
+        </w:rPr>
+        <w:t xml:space="preserve">C'est le seul compteur de la marque proposée par Wi6Labs qui voit une fuite de chasse d'eau : 16 L/h garantis à DN25 en R400, 13 L/h en R500, 10 L/h en DN20. Ses données ne sont pas chiffrées et il ne demande qu'un seul appareil par point. Second choix : le Diehl HYDRUS 2.0, plus fin encore, si Diehl confirme que les clés de chiffrement sont livrées avec les compteurs.</w:t>
+      </w:r>
+    </w:p>
+    <w:p>
+      <w:pPr>
+        <w:spacing w:after="60" w:line="240"/>
+      </w:pPr>
+      <w:r>
+        <w:rPr>
+          <w:rFonts w:ascii="Calibri" w:cs="Calibri" w:eastAsia="Calibri" w:hAnsi="Calibri"/>
+          <w:b/>
+          <w:bCs/>
+          <w:color w:val="B5651D"/>
+          <w:sz w:val="17"/>
+          <w:szCs w:val="17"/>
+        </w:rPr>
+        <w:t xml:space="preserve">Sélection provisoire, devis à demander. </w:t>
+      </w:r>
+      <w:r>
+        <w:rPr>
+          <w:rFonts w:ascii="Calibri" w:cs="Calibri" w:eastAsia="Calibri" w:hAnsi="Calibri"/>
+          <w:color w:val="1F2933"/>
+          <w:sz w:val="17"/>
+          <w:szCs w:val="17"/>
+        </w:rPr>
+        <w:t xml:space="preserve">Demander un devis du HYDROSONIC en version LoRaWAN et R500, avec son fichier de décodeur. Le choix sera confirmé après le diagnostic du plombier : diamètres réels, qui doivent rester en DN40 au plus, et débit de pointe de chaque zone, pour retenir le plus petit calibre possible.</w:t>
       </w:r>
     </w:p>
     <w:sectPr>

</xml_diff>

<commit_message>
Remplace le tableau des détecteurs de fuite par un paragraphe
Les quatre lignes du tableau disaient la même chose : un détecteur de
présence d'eau ne voit pas une chasse d'eau qui fuit et ne remplace donc
pas le sous-comptage. Un paragraphe suffit, avec les références et les
liens Airicom et EBDS, pour répondre à la piste demandée par Ivan sans
alourdir le document.

Co-Authored-By: Claude Opus 5.5 <noreply@anthropic.com>
Claude-Session: https://claude.ai/code/session_01DGGfCD6qThzdifW5Zpbw8C
</commit_message>
<xml_diff>
--- a/docs/Comparatif-materiel.docx
+++ b/docs/Comparatif-materiel.docx
@@ -661,7 +661,7 @@
               <w:keepNext/>
               <w:spacing w:after="0" w:line="222"/>
             </w:pPr>
-            <w:hyperlink w:history="1" r:id="rIdzodb3pr63kxrqbee1be-5">
+            <w:hyperlink w:history="1" r:id="rIdpsq0j70pd6vhtbmabrrsb">
               <w:r>
                 <w:rPr>
                   <w:rFonts w:ascii="Calibri" w:cs="Calibri" w:eastAsia="Calibri" w:hAnsi="Calibri"/>
@@ -682,7 +682,7 @@
               </w:rPr>
               <w:t xml:space="preserve">  ·  </w:t>
             </w:r>
-            <w:hyperlink w:history="1" r:id="rIdqw2gmm9dine_ofsnp4mcv">
+            <w:hyperlink w:history="1" r:id="rIdcxfvcwzhemahdm-rwoesa">
               <w:r>
                 <w:rPr>
                   <w:rFonts w:ascii="Calibri" w:cs="Calibri" w:eastAsia="Calibri" w:hAnsi="Calibri"/>
@@ -1000,7 +1000,7 @@
               <w:keepNext/>
               <w:spacing w:after="0" w:line="222"/>
             </w:pPr>
-            <w:hyperlink w:history="1" r:id="rIdt42s4anrtnk0be7okylx3">
+            <w:hyperlink w:history="1" r:id="rIdnlvuaa8lwidtnl1ej-e4a">
               <w:r>
                 <w:rPr>
                   <w:rFonts w:ascii="Calibri" w:cs="Calibri" w:eastAsia="Calibri" w:hAnsi="Calibri"/>
@@ -1021,7 +1021,7 @@
               </w:rPr>
               <w:t xml:space="preserve">  ·  </w:t>
             </w:r>
-            <w:hyperlink w:history="1" r:id="rIdz0lsb6l9p_aivkq-jmhmo">
+            <w:hyperlink w:history="1" r:id="rId3giym1g6eznqoa7qksz8c">
               <w:r>
                 <w:rPr>
                   <w:rFonts w:ascii="Calibri" w:cs="Calibri" w:eastAsia="Calibri" w:hAnsi="Calibri"/>
@@ -1313,7 +1313,7 @@
               <w:keepNext/>
               <w:spacing w:after="0" w:line="222"/>
             </w:pPr>
-            <w:hyperlink w:history="1" r:id="rIdqcqegv16w7shgwyosix8n">
+            <w:hyperlink w:history="1" r:id="rIdh0n24dbyv95_fbnsn4wi6">
               <w:r>
                 <w:rPr>
                   <w:rFonts w:ascii="Calibri" w:cs="Calibri" w:eastAsia="Calibri" w:hAnsi="Calibri"/>
@@ -1631,7 +1631,7 @@
               <w:keepNext/>
               <w:spacing w:after="0" w:line="222"/>
             </w:pPr>
-            <w:hyperlink w:history="1" r:id="rIdbqdszqugnflznkrrxfuz1">
+            <w:hyperlink w:history="1" r:id="rIdzdsg2mshhykxi55r8_vtu">
               <w:r>
                 <w:rPr>
                   <w:rFonts w:ascii="Calibri" w:cs="Calibri" w:eastAsia="Calibri" w:hAnsi="Calibri"/>
@@ -1652,7 +1652,7 @@
               </w:rPr>
               <w:t xml:space="preserve">  ·  </w:t>
             </w:r>
-            <w:hyperlink w:history="1" r:id="rIdvgviz2vjt8bhpsb2-nroo">
+            <w:hyperlink w:history="1" r:id="rIdzqmryfsfoyn2smjymsigt">
               <w:r>
                 <w:rPr>
                   <w:rFonts w:ascii="Calibri" w:cs="Calibri" w:eastAsia="Calibri" w:hAnsi="Calibri"/>
@@ -1978,7 +1978,7 @@
               <w:keepNext/>
               <w:spacing w:after="0" w:line="222"/>
             </w:pPr>
-            <w:hyperlink w:history="1" r:id="rIdcw8t-1phadpoleulf3tyf">
+            <w:hyperlink w:history="1" r:id="rIdoj_bgktsazofdti91qhyv">
               <w:r>
                 <w:rPr>
                   <w:rFonts w:ascii="Calibri" w:cs="Calibri" w:eastAsia="Calibri" w:hAnsi="Calibri"/>
@@ -2279,7 +2279,7 @@
               <w:keepNext/>
               <w:spacing w:after="0" w:line="222"/>
             </w:pPr>
-            <w:hyperlink w:history="1" r:id="rIddi-lznsrx2l71e2agwnmc">
+            <w:hyperlink w:history="1" r:id="rIdmwe5b2nbwmk7gwlehfrlw">
               <w:r>
                 <w:rPr>
                   <w:rFonts w:ascii="Calibri" w:cs="Calibri" w:eastAsia="Calibri" w:hAnsi="Calibri"/>
@@ -2300,7 +2300,7 @@
               </w:rPr>
               <w:t xml:space="preserve">  ·  </w:t>
             </w:r>
-            <w:hyperlink w:history="1" r:id="rId97osirqq0jxtfuzscafmx">
+            <w:hyperlink w:history="1" r:id="rIdonm7trdjfatiyoudozsu-">
               <w:r>
                 <w:rPr>
                   <w:rFonts w:ascii="Calibri" w:cs="Calibri" w:eastAsia="Calibri" w:hAnsi="Calibri"/>
@@ -2355,942 +2355,22 @@
           <w:sz w:val="22"/>
           <w:szCs w:val="22"/>
         </w:rPr>
-        <w:t xml:space="preserve">2.  Détecteurs de fuite : signaler de l'eau là où elle ne doit pas être</w:t>
+        <w:t xml:space="preserve">2.  Détecteurs de fuite : piste Airicom et EBDS</w:t>
       </w:r>
     </w:p>
-    <w:tbl>
-      <w:tblPr>
-        <w:tblW w:type="dxa" w:w="15400"/>
-        <w:tblBorders>
-          <w:top w:val="single" w:color="C3CED4" w:sz="2"/>
-          <w:left w:val="none"/>
-          <w:bottom w:val="single" w:color="C3CED4" w:sz="2"/>
-          <w:right w:val="none"/>
-          <w:insideH w:val="single" w:color="D9E1E5" w:sz="2"/>
-          <w:insideV w:val="none"/>
-        </w:tblBorders>
-      </w:tblPr>
-      <w:tblGrid>
-        <w:gridCol w:w="2400"/>
-        <w:gridCol w:w="2500"/>
-        <w:gridCol w:w="2700"/>
-        <w:gridCol w:w="2900"/>
-        <w:gridCol w:w="2700"/>
-        <w:gridCol w:w="2200"/>
-      </w:tblGrid>
-      <w:tr>
-        <w:trPr>
-          <w:tblHeader/>
-        </w:trPr>
-        <w:tc>
-          <w:tcPr>
-            <w:tcW w:type="dxa" w:w="2400"/>
-            <w:shd w:fill="0B5563" w:val="clear"/>
-            <w:tcMar>
-              <w:top w:type="dxa" w:w="50"/>
-              <w:left w:type="dxa" w:w="80"/>
-              <w:bottom w:type="dxa" w:w="50"/>
-              <w:right w:type="dxa" w:w="80"/>
-            </w:tcMar>
-          </w:tcPr>
-          <w:p>
-            <w:pPr>
-              <w:keepNext/>
-              <w:spacing w:after="0" w:line="222"/>
-            </w:pPr>
-            <w:r>
-              <w:rPr>
-                <w:rFonts w:ascii="Calibri" w:cs="Calibri" w:eastAsia="Calibri" w:hAnsi="Calibri"/>
-                <w:b/>
-                <w:bCs/>
-                <w:color w:val="FFFFFF"/>
-                <w:sz w:val="15"/>
-                <w:szCs w:val="15"/>
-              </w:rPr>
-              <w:t xml:space="preserve">Capteur</w:t>
-            </w:r>
-          </w:p>
-        </w:tc>
-        <w:tc>
-          <w:tcPr>
-            <w:tcW w:type="dxa" w:w="2500"/>
-            <w:shd w:fill="0B5563" w:val="clear"/>
-            <w:tcMar>
-              <w:top w:type="dxa" w:w="50"/>
-              <w:left w:type="dxa" w:w="80"/>
-              <w:bottom w:type="dxa" w:w="50"/>
-              <w:right w:type="dxa" w:w="80"/>
-            </w:tcMar>
-          </w:tcPr>
-          <w:p>
-            <w:pPr>
-              <w:keepNext/>
-              <w:spacing w:after="0" w:line="222"/>
-            </w:pPr>
-            <w:r>
-              <w:rPr>
-                <w:rFonts w:ascii="Calibri" w:cs="Calibri" w:eastAsia="Calibri" w:hAnsi="Calibri"/>
-                <w:b/>
-                <w:bCs/>
-                <w:color w:val="FFFFFF"/>
-                <w:sz w:val="15"/>
-                <w:szCs w:val="15"/>
-              </w:rPr>
-              <w:t xml:space="preserve">Principe</w:t>
-            </w:r>
-          </w:p>
-        </w:tc>
-        <w:tc>
-          <w:tcPr>
-            <w:tcW w:type="dxa" w:w="2700"/>
-            <w:shd w:fill="0B5563" w:val="clear"/>
-            <w:tcMar>
-              <w:top w:type="dxa" w:w="50"/>
-              <w:left w:type="dxa" w:w="80"/>
-              <w:bottom w:type="dxa" w:w="50"/>
-              <w:right w:type="dxa" w:w="80"/>
-            </w:tcMar>
-          </w:tcPr>
-          <w:p>
-            <w:pPr>
-              <w:keepNext/>
-              <w:spacing w:after="0" w:line="222"/>
-            </w:pPr>
-            <w:r>
-              <w:rPr>
-                <w:rFonts w:ascii="Calibri" w:cs="Calibri" w:eastAsia="Calibri" w:hAnsi="Calibri"/>
-                <w:b/>
-                <w:bCs/>
-                <w:color w:val="FFFFFF"/>
-                <w:sz w:val="15"/>
-                <w:szCs w:val="15"/>
-              </w:rPr>
-              <w:t xml:space="preserve">Ce qu'il détecte</w:t>
-            </w:r>
-          </w:p>
-        </w:tc>
-        <w:tc>
-          <w:tcPr>
-            <w:tcW w:type="dxa" w:w="2900"/>
-            <w:shd w:fill="0B5563" w:val="clear"/>
-            <w:tcMar>
-              <w:top w:type="dxa" w:w="50"/>
-              <w:left w:type="dxa" w:w="80"/>
-              <w:bottom w:type="dxa" w:w="50"/>
-              <w:right w:type="dxa" w:w="80"/>
-            </w:tcMar>
-          </w:tcPr>
-          <w:p>
-            <w:pPr>
-              <w:keepNext/>
-              <w:spacing w:after="0" w:line="222"/>
-            </w:pPr>
-            <w:r>
-              <w:rPr>
-                <w:rFonts w:ascii="Calibri" w:cs="Calibri" w:eastAsia="Calibri" w:hAnsi="Calibri"/>
-                <w:b/>
-                <w:bCs/>
-                <w:color w:val="FFFFFF"/>
-                <w:sz w:val="15"/>
-                <w:szCs w:val="15"/>
-              </w:rPr>
-              <w:t xml:space="preserve">Ce qu'il ne voit pas</w:t>
-            </w:r>
-          </w:p>
-        </w:tc>
-        <w:tc>
-          <w:tcPr>
-            <w:tcW w:type="dxa" w:w="2700"/>
-            <w:shd w:fill="0B5563" w:val="clear"/>
-            <w:tcMar>
-              <w:top w:type="dxa" w:w="50"/>
-              <w:left w:type="dxa" w:w="80"/>
-              <w:bottom w:type="dxa" w:w="50"/>
-              <w:right w:type="dxa" w:w="80"/>
-            </w:tcMar>
-          </w:tcPr>
-          <w:p>
-            <w:pPr>
-              <w:keepNext/>
-              <w:spacing w:after="0" w:line="222"/>
-            </w:pPr>
-            <w:r>
-              <w:rPr>
-                <w:rFonts w:ascii="Calibri" w:cs="Calibri" w:eastAsia="Calibri" w:hAnsi="Calibri"/>
-                <w:b/>
-                <w:bCs/>
-                <w:color w:val="FFFFFF"/>
-                <w:sz w:val="15"/>
-                <w:szCs w:val="15"/>
-              </w:rPr>
-              <w:t xml:space="preserve">Usage possible à l'ECAM</w:t>
-            </w:r>
-          </w:p>
-        </w:tc>
-        <w:tc>
-          <w:tcPr>
-            <w:tcW w:type="dxa" w:w="2200"/>
-            <w:shd w:fill="0B5563" w:val="clear"/>
-            <w:tcMar>
-              <w:top w:type="dxa" w:w="50"/>
-              <w:left w:type="dxa" w:w="80"/>
-              <w:bottom w:type="dxa" w:w="50"/>
-              <w:right w:type="dxa" w:w="80"/>
-            </w:tcMar>
-          </w:tcPr>
-          <w:p>
-            <w:pPr>
-              <w:keepNext/>
-              <w:spacing w:after="0" w:line="222"/>
-            </w:pPr>
-            <w:r>
-              <w:rPr>
-                <w:rFonts w:ascii="Calibri" w:cs="Calibri" w:eastAsia="Calibri" w:hAnsi="Calibri"/>
-                <w:b/>
-                <w:bCs/>
-                <w:color w:val="FFFFFF"/>
-                <w:sz w:val="15"/>
-                <w:szCs w:val="15"/>
-              </w:rPr>
-              <w:t xml:space="preserve">Où l'acheter</w:t>
-            </w:r>
-          </w:p>
-        </w:tc>
-      </w:tr>
-      <w:tr>
-        <w:trPr>
-          <w:cantSplit/>
-        </w:trPr>
-        <w:tc>
-          <w:tcPr>
-            <w:tcW w:type="dxa" w:w="2400"/>
-            <w:tcMar>
-              <w:top w:type="dxa" w:w="50"/>
-              <w:left w:type="dxa" w:w="80"/>
-              <w:bottom w:type="dxa" w:w="50"/>
-              <w:right w:type="dxa" w:w="80"/>
-            </w:tcMar>
-          </w:tcPr>
-          <w:p>
-            <w:pPr>
-              <w:keepNext/>
-              <w:spacing w:after="0" w:line="222"/>
-            </w:pPr>
-            <w:r>
-              <w:rPr>
-                <w:rFonts w:ascii="Calibri" w:cs="Calibri" w:eastAsia="Calibri" w:hAnsi="Calibri"/>
-                <w:b/>
-                <w:bCs/>
-                <w:color w:val="1F2933"/>
-                <w:sz w:val="15"/>
-                <w:szCs w:val="15"/>
-              </w:rPr>
-              <w:t xml:space="preserve">Milesight EM300-SLD</w:t>
-            </w:r>
-          </w:p>
-        </w:tc>
-        <w:tc>
-          <w:tcPr>
-            <w:tcW w:type="dxa" w:w="2500"/>
-            <w:tcMar>
-              <w:top w:type="dxa" w:w="50"/>
-              <w:left w:type="dxa" w:w="80"/>
-              <w:bottom w:type="dxa" w:w="50"/>
-              <w:right w:type="dxa" w:w="80"/>
-            </w:tcMar>
-          </w:tcPr>
-          <w:p>
-            <w:pPr>
-              <w:keepNext/>
-              <w:spacing w:after="0" w:line="222"/>
-            </w:pPr>
-            <w:r>
-              <w:rPr>
-                <w:rFonts w:ascii="Calibri" w:cs="Calibri" w:eastAsia="Calibri" w:hAnsi="Calibri"/>
-                <w:b w:val="false"/>
-                <w:bCs w:val="false"/>
-                <w:color w:val="1F2933"/>
-                <w:sz w:val="15"/>
-                <w:szCs w:val="15"/>
-              </w:rPr>
-              <w:t xml:space="preserve">Sonde ponctuelle inox</w:t>
-            </w:r>
-          </w:p>
-        </w:tc>
-        <w:tc>
-          <w:tcPr>
-            <w:tcW w:type="dxa" w:w="2700"/>
-            <w:tcMar>
-              <w:top w:type="dxa" w:w="50"/>
-              <w:left w:type="dxa" w:w="80"/>
-              <w:bottom w:type="dxa" w:w="50"/>
-              <w:right w:type="dxa" w:w="80"/>
-            </w:tcMar>
-          </w:tcPr>
-          <w:p>
-            <w:pPr>
-              <w:keepNext/>
-              <w:spacing w:after="0" w:line="222"/>
-            </w:pPr>
-            <w:r>
-              <w:rPr>
-                <w:rFonts w:ascii="Calibri" w:cs="Calibri" w:eastAsia="Calibri" w:hAnsi="Calibri"/>
-                <w:b w:val="false"/>
-                <w:bCs w:val="false"/>
-                <w:color w:val="1F2933"/>
-                <w:sz w:val="15"/>
-                <w:szCs w:val="15"/>
-              </w:rPr>
-              <w:t xml:space="preserve">Eau au sol dès 5 mm de hauteur</w:t>
-            </w:r>
-          </w:p>
-        </w:tc>
-        <w:tc>
-          <w:tcPr>
-            <w:tcW w:type="dxa" w:w="2900"/>
-            <w:tcMar>
-              <w:top w:type="dxa" w:w="50"/>
-              <w:left w:type="dxa" w:w="80"/>
-              <w:bottom w:type="dxa" w:w="50"/>
-              <w:right w:type="dxa" w:w="80"/>
-            </w:tcMar>
-          </w:tcPr>
-          <w:p>
-            <w:pPr>
-              <w:keepNext/>
-              <w:spacing w:after="0" w:line="222"/>
-            </w:pPr>
-            <w:r>
-              <w:rPr>
-                <w:rFonts w:ascii="Calibri" w:cs="Calibri" w:eastAsia="Calibri" w:hAnsi="Calibri"/>
-                <w:b w:val="false"/>
-                <w:bCs w:val="false"/>
-                <w:color w:val="1F2933"/>
-                <w:sz w:val="15"/>
-                <w:szCs w:val="15"/>
-              </w:rPr>
-              <w:t xml:space="preserve">Une chasse d'eau qui fuit : l'eau part à l'égout</w:t>
-            </w:r>
-          </w:p>
-        </w:tc>
-        <w:tc>
-          <w:tcPr>
-            <w:tcW w:type="dxa" w:w="2700"/>
-            <w:tcMar>
-              <w:top w:type="dxa" w:w="50"/>
-              <w:left w:type="dxa" w:w="80"/>
-              <w:bottom w:type="dxa" w:w="50"/>
-              <w:right w:type="dxa" w:w="80"/>
-            </w:tcMar>
-          </w:tcPr>
-          <w:p>
-            <w:pPr>
-              <w:keepNext/>
-              <w:spacing w:after="0" w:line="222"/>
-            </w:pPr>
-            <w:r>
-              <w:rPr>
-                <w:rFonts w:ascii="Calibri" w:cs="Calibri" w:eastAsia="Calibri" w:hAnsi="Calibri"/>
-                <w:b w:val="false"/>
-                <w:bCs w:val="false"/>
-                <w:color w:val="1F2933"/>
-                <w:sz w:val="15"/>
-                <w:szCs w:val="15"/>
-              </w:rPr>
-              <w:t xml:space="preserve">Pied de compteur, local technique</w:t>
-            </w:r>
-          </w:p>
-        </w:tc>
-        <w:tc>
-          <w:tcPr>
-            <w:tcW w:type="dxa" w:w="2200"/>
-            <w:tcMar>
-              <w:top w:type="dxa" w:w="50"/>
-              <w:left w:type="dxa" w:w="80"/>
-              <w:bottom w:type="dxa" w:w="50"/>
-              <w:right w:type="dxa" w:w="80"/>
-            </w:tcMar>
-          </w:tcPr>
-          <w:p>
-            <w:pPr>
-              <w:keepNext/>
-              <w:spacing w:after="0" w:line="222"/>
-            </w:pPr>
-            <w:hyperlink w:history="1" r:id="rIdl5iutas4ghhx9akwqaqs1">
-              <w:r>
-                <w:rPr>
-                  <w:rFonts w:ascii="Calibri" w:cs="Calibri" w:eastAsia="Calibri" w:hAnsi="Calibri"/>
-                  <w:color w:val="0B5563"/>
-                  <w:sz w:val="15"/>
-                  <w:szCs w:val="15"/>
-                  <w:u w:val="single"/>
-                </w:rPr>
-                <w:t xml:space="preserve">Airicom</w:t>
-              </w:r>
-            </w:hyperlink>
-          </w:p>
-        </w:tc>
-      </w:tr>
-      <w:tr>
-        <w:trPr>
-          <w:cantSplit/>
-        </w:trPr>
-        <w:tc>
-          <w:tcPr>
-            <w:tcW w:type="dxa" w:w="2400"/>
-            <w:shd w:fill="EDF2F4" w:val="clear"/>
-            <w:tcMar>
-              <w:top w:type="dxa" w:w="50"/>
-              <w:left w:type="dxa" w:w="80"/>
-              <w:bottom w:type="dxa" w:w="50"/>
-              <w:right w:type="dxa" w:w="80"/>
-            </w:tcMar>
-          </w:tcPr>
-          <w:p>
-            <w:pPr>
-              <w:keepNext/>
-              <w:spacing w:after="0" w:line="222"/>
-            </w:pPr>
-            <w:r>
-              <w:rPr>
-                <w:rFonts w:ascii="Calibri" w:cs="Calibri" w:eastAsia="Calibri" w:hAnsi="Calibri"/>
-                <w:b/>
-                <w:bCs/>
-                <w:color w:val="1F2933"/>
-                <w:sz w:val="15"/>
-                <w:szCs w:val="15"/>
-              </w:rPr>
-              <w:t xml:space="preserve">Milesight EM300-ZLD</w:t>
-            </w:r>
-          </w:p>
-        </w:tc>
-        <w:tc>
-          <w:tcPr>
-            <w:tcW w:type="dxa" w:w="2500"/>
-            <w:shd w:fill="EDF2F4" w:val="clear"/>
-            <w:tcMar>
-              <w:top w:type="dxa" w:w="50"/>
-              <w:left w:type="dxa" w:w="80"/>
-              <w:bottom w:type="dxa" w:w="50"/>
-              <w:right w:type="dxa" w:w="80"/>
-            </w:tcMar>
-          </w:tcPr>
-          <w:p>
-            <w:pPr>
-              <w:keepNext/>
-              <w:spacing w:after="0" w:line="222"/>
-            </w:pPr>
-            <w:r>
-              <w:rPr>
-                <w:rFonts w:ascii="Calibri" w:cs="Calibri" w:eastAsia="Calibri" w:hAnsi="Calibri"/>
-                <w:b w:val="false"/>
-                <w:bCs w:val="false"/>
-                <w:color w:val="1F2933"/>
-                <w:sz w:val="15"/>
-                <w:szCs w:val="15"/>
-              </w:rPr>
-              <w:t xml:space="preserve">Câble de détection de 3 m</w:t>
-            </w:r>
-          </w:p>
-        </w:tc>
-        <w:tc>
-          <w:tcPr>
-            <w:tcW w:type="dxa" w:w="2700"/>
-            <w:shd w:fill="EDF2F4" w:val="clear"/>
-            <w:tcMar>
-              <w:top w:type="dxa" w:w="50"/>
-              <w:left w:type="dxa" w:w="80"/>
-              <w:bottom w:type="dxa" w:w="50"/>
-              <w:right w:type="dxa" w:w="80"/>
-            </w:tcMar>
-          </w:tcPr>
-          <w:p>
-            <w:pPr>
-              <w:keepNext/>
-              <w:spacing w:after="0" w:line="222"/>
-            </w:pPr>
-            <w:r>
-              <w:rPr>
-                <w:rFonts w:ascii="Calibri" w:cs="Calibri" w:eastAsia="Calibri" w:hAnsi="Calibri"/>
-                <w:b w:val="false"/>
-                <w:bCs w:val="false"/>
-                <w:color w:val="1F2933"/>
-                <w:sz w:val="15"/>
-                <w:szCs w:val="15"/>
-              </w:rPr>
-              <w:t xml:space="preserve">Eau sur tout le linéaire du câble</w:t>
-            </w:r>
-          </w:p>
-        </w:tc>
-        <w:tc>
-          <w:tcPr>
-            <w:tcW w:type="dxa" w:w="2900"/>
-            <w:shd w:fill="EDF2F4" w:val="clear"/>
-            <w:tcMar>
-              <w:top w:type="dxa" w:w="50"/>
-              <w:left w:type="dxa" w:w="80"/>
-              <w:bottom w:type="dxa" w:w="50"/>
-              <w:right w:type="dxa" w:w="80"/>
-            </w:tcMar>
-          </w:tcPr>
-          <w:p>
-            <w:pPr>
-              <w:keepNext/>
-              <w:spacing w:after="0" w:line="222"/>
-            </w:pPr>
-            <w:r>
-              <w:rPr>
-                <w:rFonts w:ascii="Calibri" w:cs="Calibri" w:eastAsia="Calibri" w:hAnsi="Calibri"/>
-                <w:b w:val="false"/>
-                <w:bCs w:val="false"/>
-                <w:color w:val="1F2933"/>
-                <w:sz w:val="15"/>
-                <w:szCs w:val="15"/>
-              </w:rPr>
-              <w:t xml:space="preserve">Idem</w:t>
-            </w:r>
-          </w:p>
-        </w:tc>
-        <w:tc>
-          <w:tcPr>
-            <w:tcW w:type="dxa" w:w="2700"/>
-            <w:shd w:fill="EDF2F4" w:val="clear"/>
-            <w:tcMar>
-              <w:top w:type="dxa" w:w="50"/>
-              <w:left w:type="dxa" w:w="80"/>
-              <w:bottom w:type="dxa" w:w="50"/>
-              <w:right w:type="dxa" w:w="80"/>
-            </w:tcMar>
-          </w:tcPr>
-          <w:p>
-            <w:pPr>
-              <w:keepNext/>
-              <w:spacing w:after="0" w:line="222"/>
-            </w:pPr>
-            <w:r>
-              <w:rPr>
-                <w:rFonts w:ascii="Calibri" w:cs="Calibri" w:eastAsia="Calibri" w:hAnsi="Calibri"/>
-                <w:b w:val="false"/>
-                <w:bCs w:val="false"/>
-                <w:color w:val="1F2933"/>
-                <w:sz w:val="15"/>
-                <w:szCs w:val="15"/>
-              </w:rPr>
-              <w:t xml:space="preserve">Le long d'une canalisation en sous-plafond</w:t>
-            </w:r>
-          </w:p>
-        </w:tc>
-        <w:tc>
-          <w:tcPr>
-            <w:tcW w:type="dxa" w:w="2200"/>
-            <w:shd w:fill="EDF2F4" w:val="clear"/>
-            <w:tcMar>
-              <w:top w:type="dxa" w:w="50"/>
-              <w:left w:type="dxa" w:w="80"/>
-              <w:bottom w:type="dxa" w:w="50"/>
-              <w:right w:type="dxa" w:w="80"/>
-            </w:tcMar>
-          </w:tcPr>
-          <w:p>
-            <w:pPr>
-              <w:keepNext/>
-              <w:spacing w:after="0" w:line="222"/>
-            </w:pPr>
-            <w:hyperlink w:history="1" r:id="rId7k64tfqv6xdyziivv3snk">
-              <w:r>
-                <w:rPr>
-                  <w:rFonts w:ascii="Calibri" w:cs="Calibri" w:eastAsia="Calibri" w:hAnsi="Calibri"/>
-                  <w:color w:val="0B5563"/>
-                  <w:sz w:val="15"/>
-                  <w:szCs w:val="15"/>
-                  <w:u w:val="single"/>
-                </w:rPr>
-                <w:t xml:space="preserve">EBDS</w:t>
-              </w:r>
-            </w:hyperlink>
-            <w:r>
-              <w:rPr>
-                <w:rFonts w:ascii="Calibri" w:cs="Calibri" w:eastAsia="Calibri" w:hAnsi="Calibri"/>
-                <w:color w:val="1F2933"/>
-                <w:sz w:val="15"/>
-                <w:szCs w:val="15"/>
-              </w:rPr>
-              <w:t xml:space="preserve">  ·  </w:t>
-            </w:r>
-            <w:hyperlink w:history="1" r:id="rIdjt3i0sngqd2z3en7okpjn">
-              <w:r>
-                <w:rPr>
-                  <w:rFonts w:ascii="Calibri" w:cs="Calibri" w:eastAsia="Calibri" w:hAnsi="Calibri"/>
-                  <w:color w:val="0B5563"/>
-                  <w:sz w:val="15"/>
-                  <w:szCs w:val="15"/>
-                  <w:u w:val="single"/>
-                </w:rPr>
-                <w:t xml:space="preserve">Airicom</w:t>
-              </w:r>
-            </w:hyperlink>
-          </w:p>
-        </w:tc>
-      </w:tr>
-      <w:tr>
-        <w:trPr>
-          <w:cantSplit/>
-        </w:trPr>
-        <w:tc>
-          <w:tcPr>
-            <w:tcW w:type="dxa" w:w="2400"/>
-            <w:tcMar>
-              <w:top w:type="dxa" w:w="50"/>
-              <w:left w:type="dxa" w:w="80"/>
-              <w:bottom w:type="dxa" w:w="50"/>
-              <w:right w:type="dxa" w:w="80"/>
-            </w:tcMar>
-          </w:tcPr>
-          <w:p>
-            <w:pPr>
-              <w:keepNext/>
-              <w:spacing w:after="0" w:line="222"/>
-            </w:pPr>
-            <w:r>
-              <w:rPr>
-                <w:rFonts w:ascii="Calibri" w:cs="Calibri" w:eastAsia="Calibri" w:hAnsi="Calibri"/>
-                <w:b/>
-                <w:bCs/>
-                <w:color w:val="1F2933"/>
-                <w:sz w:val="15"/>
-                <w:szCs w:val="15"/>
-              </w:rPr>
-              <w:t xml:space="preserve">Milesight EM300-MLD</w:t>
-            </w:r>
-          </w:p>
-        </w:tc>
-        <w:tc>
-          <w:tcPr>
-            <w:tcW w:type="dxa" w:w="2500"/>
-            <w:tcMar>
-              <w:top w:type="dxa" w:w="50"/>
-              <w:left w:type="dxa" w:w="80"/>
-              <w:bottom w:type="dxa" w:w="50"/>
-              <w:right w:type="dxa" w:w="80"/>
-            </w:tcMar>
-          </w:tcPr>
-          <w:p>
-            <w:pPr>
-              <w:keepNext/>
-              <w:spacing w:after="0" w:line="222"/>
-            </w:pPr>
-            <w:r>
-              <w:rPr>
-                <w:rFonts w:ascii="Calibri" w:cs="Calibri" w:eastAsia="Calibri" w:hAnsi="Calibri"/>
-                <w:b w:val="false"/>
-                <w:bCs w:val="false"/>
-                <w:color w:val="1F2933"/>
-                <w:sz w:val="15"/>
-                <w:szCs w:val="15"/>
-              </w:rPr>
-              <w:t xml:space="preserve">Membrane de 40 × 40 cm</w:t>
-            </w:r>
-          </w:p>
-        </w:tc>
-        <w:tc>
-          <w:tcPr>
-            <w:tcW w:type="dxa" w:w="2700"/>
-            <w:tcMar>
-              <w:top w:type="dxa" w:w="50"/>
-              <w:left w:type="dxa" w:w="80"/>
-              <w:bottom w:type="dxa" w:w="50"/>
-              <w:right w:type="dxa" w:w="80"/>
-            </w:tcMar>
-          </w:tcPr>
-          <w:p>
-            <w:pPr>
-              <w:keepNext/>
-              <w:spacing w:after="0" w:line="222"/>
-            </w:pPr>
-            <w:r>
-              <w:rPr>
-                <w:rFonts w:ascii="Calibri" w:cs="Calibri" w:eastAsia="Calibri" w:hAnsi="Calibri"/>
-                <w:b w:val="false"/>
-                <w:bCs w:val="false"/>
-                <w:color w:val="1F2933"/>
-                <w:sz w:val="15"/>
-                <w:szCs w:val="15"/>
-              </w:rPr>
-              <w:t xml:space="preserve">Eau sur une surface</w:t>
-            </w:r>
-          </w:p>
-        </w:tc>
-        <w:tc>
-          <w:tcPr>
-            <w:tcW w:type="dxa" w:w="2900"/>
-            <w:tcMar>
-              <w:top w:type="dxa" w:w="50"/>
-              <w:left w:type="dxa" w:w="80"/>
-              <w:bottom w:type="dxa" w:w="50"/>
-              <w:right w:type="dxa" w:w="80"/>
-            </w:tcMar>
-          </w:tcPr>
-          <w:p>
-            <w:pPr>
-              <w:keepNext/>
-              <w:spacing w:after="0" w:line="222"/>
-            </w:pPr>
-            <w:r>
-              <w:rPr>
-                <w:rFonts w:ascii="Calibri" w:cs="Calibri" w:eastAsia="Calibri" w:hAnsi="Calibri"/>
-                <w:b w:val="false"/>
-                <w:bCs w:val="false"/>
-                <w:color w:val="1F2933"/>
-                <w:sz w:val="15"/>
-                <w:szCs w:val="15"/>
-              </w:rPr>
-              <w:t xml:space="preserve">Idem</w:t>
-            </w:r>
-          </w:p>
-        </w:tc>
-        <w:tc>
-          <w:tcPr>
-            <w:tcW w:type="dxa" w:w="2700"/>
-            <w:tcMar>
-              <w:top w:type="dxa" w:w="50"/>
-              <w:left w:type="dxa" w:w="80"/>
-              <w:bottom w:type="dxa" w:w="50"/>
-              <w:right w:type="dxa" w:w="80"/>
-            </w:tcMar>
-          </w:tcPr>
-          <w:p>
-            <w:pPr>
-              <w:keepNext/>
-              <w:spacing w:after="0" w:line="222"/>
-            </w:pPr>
-            <w:r>
-              <w:rPr>
-                <w:rFonts w:ascii="Calibri" w:cs="Calibri" w:eastAsia="Calibri" w:hAnsi="Calibri"/>
-                <w:b w:val="false"/>
-                <w:bCs w:val="false"/>
-                <w:color w:val="1F2933"/>
-                <w:sz w:val="15"/>
-                <w:szCs w:val="15"/>
-              </w:rPr>
-              <w:t xml:space="preserve">Sous un point sensible, sur une dalle de faux plafond</w:t>
-            </w:r>
-          </w:p>
-        </w:tc>
-        <w:tc>
-          <w:tcPr>
-            <w:tcW w:type="dxa" w:w="2200"/>
-            <w:tcMar>
-              <w:top w:type="dxa" w:w="50"/>
-              <w:left w:type="dxa" w:w="80"/>
-              <w:bottom w:type="dxa" w:w="50"/>
-              <w:right w:type="dxa" w:w="80"/>
-            </w:tcMar>
-          </w:tcPr>
-          <w:p>
-            <w:pPr>
-              <w:keepNext/>
-              <w:spacing w:after="0" w:line="222"/>
-            </w:pPr>
-            <w:hyperlink w:history="1" r:id="rIdfl8gq6lhnrqktfv9lctqd">
-              <w:r>
-                <w:rPr>
-                  <w:rFonts w:ascii="Calibri" w:cs="Calibri" w:eastAsia="Calibri" w:hAnsi="Calibri"/>
-                  <w:color w:val="0B5563"/>
-                  <w:sz w:val="15"/>
-                  <w:szCs w:val="15"/>
-                  <w:u w:val="single"/>
-                </w:rPr>
-                <w:t xml:space="preserve">Airicom</w:t>
-              </w:r>
-            </w:hyperlink>
-          </w:p>
-        </w:tc>
-      </w:tr>
-      <w:tr>
-        <w:trPr>
-          <w:cantSplit/>
-        </w:trPr>
-        <w:tc>
-          <w:tcPr>
-            <w:tcW w:type="dxa" w:w="2400"/>
-            <w:shd w:fill="EDF2F4" w:val="clear"/>
-            <w:tcMar>
-              <w:top w:type="dxa" w:w="50"/>
-              <w:left w:type="dxa" w:w="80"/>
-              <w:bottom w:type="dxa" w:w="50"/>
-              <w:right w:type="dxa" w:w="80"/>
-            </w:tcMar>
-          </w:tcPr>
-          <w:p>
-            <w:pPr>
-              <w:keepNext/>
-              <w:spacing w:after="0" w:line="222"/>
-            </w:pPr>
-            <w:r>
-              <w:rPr>
-                <w:rFonts w:ascii="Calibri" w:cs="Calibri" w:eastAsia="Calibri" w:hAnsi="Calibri"/>
-                <w:b/>
-                <w:bCs/>
-                <w:color w:val="1F2933"/>
-                <w:sz w:val="15"/>
-                <w:szCs w:val="15"/>
-              </w:rPr>
-              <w:t xml:space="preserve">Watteco Humid'O</w:t>
-            </w:r>
-          </w:p>
-        </w:tc>
-        <w:tc>
-          <w:tcPr>
-            <w:tcW w:type="dxa" w:w="2500"/>
-            <w:shd w:fill="EDF2F4" w:val="clear"/>
-            <w:tcMar>
-              <w:top w:type="dxa" w:w="50"/>
-              <w:left w:type="dxa" w:w="80"/>
-              <w:bottom w:type="dxa" w:w="50"/>
-              <w:right w:type="dxa" w:w="80"/>
-            </w:tcMar>
-          </w:tcPr>
-          <w:p>
-            <w:pPr>
-              <w:keepNext/>
-              <w:spacing w:after="0" w:line="222"/>
-            </w:pPr>
-            <w:r>
-              <w:rPr>
-                <w:rFonts w:ascii="Calibri" w:cs="Calibri" w:eastAsia="Calibri" w:hAnsi="Calibri"/>
-                <w:b w:val="false"/>
-                <w:bCs w:val="false"/>
-                <w:color w:val="1F2933"/>
-                <w:sz w:val="15"/>
-                <w:szCs w:val="15"/>
-              </w:rPr>
-              <w:t xml:space="preserve">Détection au sol</w:t>
-            </w:r>
-          </w:p>
-        </w:tc>
-        <w:tc>
-          <w:tcPr>
-            <w:tcW w:type="dxa" w:w="2700"/>
-            <w:shd w:fill="EDF2F4" w:val="clear"/>
-            <w:tcMar>
-              <w:top w:type="dxa" w:w="50"/>
-              <w:left w:type="dxa" w:w="80"/>
-              <w:bottom w:type="dxa" w:w="50"/>
-              <w:right w:type="dxa" w:w="80"/>
-            </w:tcMar>
-          </w:tcPr>
-          <w:p>
-            <w:pPr>
-              <w:keepNext/>
-              <w:spacing w:after="0" w:line="222"/>
-            </w:pPr>
-            <w:r>
-              <w:rPr>
-                <w:rFonts w:ascii="Calibri" w:cs="Calibri" w:eastAsia="Calibri" w:hAnsi="Calibri"/>
-                <w:b w:val="false"/>
-                <w:bCs w:val="false"/>
-                <w:color w:val="1F2933"/>
-                <w:sz w:val="15"/>
-                <w:szCs w:val="15"/>
-              </w:rPr>
-              <w:t xml:space="preserve">Eau au sol</w:t>
-            </w:r>
-          </w:p>
-        </w:tc>
-        <w:tc>
-          <w:tcPr>
-            <w:tcW w:type="dxa" w:w="2900"/>
-            <w:shd w:fill="EDF2F4" w:val="clear"/>
-            <w:tcMar>
-              <w:top w:type="dxa" w:w="50"/>
-              <w:left w:type="dxa" w:w="80"/>
-              <w:bottom w:type="dxa" w:w="50"/>
-              <w:right w:type="dxa" w:w="80"/>
-            </w:tcMar>
-          </w:tcPr>
-          <w:p>
-            <w:pPr>
-              <w:keepNext/>
-              <w:spacing w:after="0" w:line="222"/>
-            </w:pPr>
-            <w:r>
-              <w:rPr>
-                <w:rFonts w:ascii="Calibri" w:cs="Calibri" w:eastAsia="Calibri" w:hAnsi="Calibri"/>
-                <w:b w:val="false"/>
-                <w:bCs w:val="false"/>
-                <w:color w:val="1F2933"/>
-                <w:sz w:val="15"/>
-                <w:szCs w:val="15"/>
-              </w:rPr>
-              <w:t xml:space="preserve">Idem</w:t>
-            </w:r>
-          </w:p>
-        </w:tc>
-        <w:tc>
-          <w:tcPr>
-            <w:tcW w:type="dxa" w:w="2700"/>
-            <w:shd w:fill="EDF2F4" w:val="clear"/>
-            <w:tcMar>
-              <w:top w:type="dxa" w:w="50"/>
-              <w:left w:type="dxa" w:w="80"/>
-              <w:bottom w:type="dxa" w:w="50"/>
-              <w:right w:type="dxa" w:w="80"/>
-            </w:tcMar>
-          </w:tcPr>
-          <w:p>
-            <w:pPr>
-              <w:keepNext/>
-              <w:spacing w:after="0" w:line="222"/>
-            </w:pPr>
-            <w:r>
-              <w:rPr>
-                <w:rFonts w:ascii="Calibri" w:cs="Calibri" w:eastAsia="Calibri" w:hAnsi="Calibri"/>
-                <w:b w:val="false"/>
-                <w:bCs w:val="false"/>
-                <w:color w:val="1F2933"/>
-                <w:sz w:val="15"/>
-                <w:szCs w:val="15"/>
-              </w:rPr>
-              <w:t xml:space="preserve">Local technique</w:t>
-            </w:r>
-          </w:p>
-        </w:tc>
-        <w:tc>
-          <w:tcPr>
-            <w:tcW w:type="dxa" w:w="2200"/>
-            <w:shd w:fill="EDF2F4" w:val="clear"/>
-            <w:tcMar>
-              <w:top w:type="dxa" w:w="50"/>
-              <w:left w:type="dxa" w:w="80"/>
-              <w:bottom w:type="dxa" w:w="50"/>
-              <w:right w:type="dxa" w:w="80"/>
-            </w:tcMar>
-          </w:tcPr>
-          <w:p>
-            <w:pPr>
-              <w:keepNext/>
-              <w:spacing w:after="0" w:line="222"/>
-            </w:pPr>
-            <w:hyperlink w:history="1" r:id="rId-utkxnrtlrbfa59wbqypc">
-              <w:r>
-                <w:rPr>
-                  <w:rFonts w:ascii="Calibri" w:cs="Calibri" w:eastAsia="Calibri" w:hAnsi="Calibri"/>
-                  <w:color w:val="0B5563"/>
-                  <w:sz w:val="15"/>
-                  <w:szCs w:val="15"/>
-                  <w:u w:val="single"/>
-                </w:rPr>
-                <w:t xml:space="preserve">Airicom</w:t>
-              </w:r>
-            </w:hyperlink>
-          </w:p>
-        </w:tc>
-      </w:tr>
-    </w:tbl>
     <w:p>
       <w:pPr>
-        <w:spacing w:after="60" w:before="80" w:line="240"/>
+        <w:spacing w:after="60" w:line="240"/>
       </w:pPr>
+      <w:r>
+        <w:rPr>
+          <w:rFonts w:ascii="Calibri" w:cs="Calibri" w:eastAsia="Calibri" w:hAnsi="Calibri"/>
+          <w:color w:val="1F2933"/>
+          <w:sz w:val="17"/>
+          <w:szCs w:val="17"/>
+        </w:rPr>
+        <w:t xml:space="preserve">Airicom et EBDS proposent des détecteurs de présence d'eau : sonde ponctuelle, câble de 3 m ou membrane, comme les Milesight EM300-SLD, EM300-ZLD et EM300-MLD ou le Watteco Humid'O. Ils signalent de l'eau au sol, mais </w:t>
+      </w:r>
       <w:r>
         <w:rPr>
           <w:rFonts w:ascii="Calibri" w:cs="Calibri" w:eastAsia="Calibri" w:hAnsi="Calibri"/>
@@ -3300,7 +2380,7 @@
           <w:sz w:val="17"/>
           <w:szCs w:val="17"/>
         </w:rPr>
-        <w:t xml:space="preserve">Complémentaires, pas concurrents. </w:t>
+        <w:t xml:space="preserve">ne voient pas la fuite la plus courante</w:t>
       </w:r>
       <w:r>
         <w:rPr>
@@ -3309,8 +2389,41 @@
           <w:sz w:val="17"/>
           <w:szCs w:val="17"/>
         </w:rPr>
-        <w:t xml:space="preserve">Un compteur dit qu'un débit anormal existe quelque part dans une zone ; un détecteur dit qu'il y a de l'eau à un endroit précis. Aucun détecteur ne remplace le sous-comptage, puisque la fuite la plus courante ne met jamais d'eau au sol.</w:t>
-      </w:r>
+        <w:t xml:space="preserve"> : une chasse d'eau qui fuit s'écoule directement à l'égout. Ils ne remplacent donc pas le sous-comptage. Ils ne sont pas retenus à ce stade ; ils pourraient compléter le dispositif sous une canalisation en sous-plafond. </w:t>
+      </w:r>
+      <w:hyperlink w:history="1" r:id="rId0umme2ckto1uogpvjv3ok">
+        <w:r>
+          <w:rPr>
+            <w:rFonts w:ascii="Calibri" w:cs="Calibri" w:eastAsia="Calibri" w:hAnsi="Calibri"/>
+            <w:color w:val="0B5563"/>
+            <w:sz w:val="15"/>
+            <w:szCs w:val="15"/>
+            <w:u w:val="single"/>
+          </w:rPr>
+          <w:t xml:space="preserve">Airicom</w:t>
+        </w:r>
+      </w:hyperlink>
+      <w:r>
+        <w:rPr>
+          <w:rFonts w:ascii="Calibri" w:cs="Calibri" w:eastAsia="Calibri" w:hAnsi="Calibri"/>
+          <w:color w:val="1F2933"/>
+          <w:sz w:val="15"/>
+          <w:szCs w:val="15"/>
+        </w:rPr>
+        <w:t xml:space="preserve">  ·  </w:t>
+      </w:r>
+      <w:hyperlink w:history="1" r:id="rIdftzbqtrfj3tpfr4c8r9so">
+        <w:r>
+          <w:rPr>
+            <w:rFonts w:ascii="Calibri" w:cs="Calibri" w:eastAsia="Calibri" w:hAnsi="Calibri"/>
+            <w:color w:val="0B5563"/>
+            <w:sz w:val="15"/>
+            <w:szCs w:val="15"/>
+            <w:u w:val="single"/>
+          </w:rPr>
+          <w:t xml:space="preserve">EBDS</w:t>
+        </w:r>
+      </w:hyperlink>
     </w:p>
     <w:p>
       <w:pPr>
@@ -3445,7 +2558,7 @@
         </w:rPr>
         <w:t xml:space="preserve">ultrasonique à radio LoRaWAN intégrée, R400 en standard et R500 sur demande, DN15 à DN40, pile de 13 ans, décodeur fourni par B-meters. </w:t>
       </w:r>
-      <w:hyperlink w:history="1" r:id="rIdupd358x9ntbeojyard1t7">
+      <w:hyperlink w:history="1" r:id="rIdrsvoa-8gxvwzxrxhc0b0d">
         <w:r>
           <w:rPr>
             <w:rFonts w:ascii="Calibri" w:cs="Calibri" w:eastAsia="Calibri" w:hAnsi="Calibri"/>

</xml_diff>

<commit_message>
Ajoute le HYDROSONIC au tableau du comparatif matériel
La conclusion retenait le B-meters HYDROSONIC alors qu'il ne figurait pas
dans le tableau comparatif. Il y entre en dernière ligne, surlignée comme
choix retenu et signalée hors liste Wi6Labs. La numérotation des autres
options est conservée, de sorte que les renvois du texte restent justes.

Co-Authored-By: Claude Opus 5.5 <noreply@anthropic.com>
Claude-Session: https://claude.ai/code/session_01DGGfCD6qThzdifW5Zpbw8C
</commit_message>
<xml_diff>
--- a/docs/Comparatif-materiel.docx
+++ b/docs/Comparatif-materiel.docx
@@ -661,7 +661,7 @@
               <w:keepNext/>
               <w:spacing w:after="0" w:line="222"/>
             </w:pPr>
-            <w:hyperlink w:history="1" r:id="rIdpsq0j70pd6vhtbmabrrsb">
+            <w:hyperlink w:history="1" r:id="rIdjklx5y9ba0oaglin4bce8">
               <w:r>
                 <w:rPr>
                   <w:rFonts w:ascii="Calibri" w:cs="Calibri" w:eastAsia="Calibri" w:hAnsi="Calibri"/>
@@ -682,7 +682,7 @@
               </w:rPr>
               <w:t xml:space="preserve">  ·  </w:t>
             </w:r>
-            <w:hyperlink w:history="1" r:id="rIdcxfvcwzhemahdm-rwoesa">
+            <w:hyperlink w:history="1" r:id="rId0_i34juo6mddgpu7qqoxr">
               <w:r>
                 <w:rPr>
                   <w:rFonts w:ascii="Calibri" w:cs="Calibri" w:eastAsia="Calibri" w:hAnsi="Calibri"/>
@@ -1000,7 +1000,7 @@
               <w:keepNext/>
               <w:spacing w:after="0" w:line="222"/>
             </w:pPr>
-            <w:hyperlink w:history="1" r:id="rIdnlvuaa8lwidtnl1ej-e4a">
+            <w:hyperlink w:history="1" r:id="rIdpoo8iyowytmdtf8uuafjw">
               <w:r>
                 <w:rPr>
                   <w:rFonts w:ascii="Calibri" w:cs="Calibri" w:eastAsia="Calibri" w:hAnsi="Calibri"/>
@@ -1021,7 +1021,7 @@
               </w:rPr>
               <w:t xml:space="preserve">  ·  </w:t>
             </w:r>
-            <w:hyperlink w:history="1" r:id="rId3giym1g6eznqoa7qksz8c">
+            <w:hyperlink w:history="1" r:id="rIdngjkdu5isguk5gnhdgcik">
               <w:r>
                 <w:rPr>
                   <w:rFonts w:ascii="Calibri" w:cs="Calibri" w:eastAsia="Calibri" w:hAnsi="Calibri"/>
@@ -1313,7 +1313,7 @@
               <w:keepNext/>
               <w:spacing w:after="0" w:line="222"/>
             </w:pPr>
-            <w:hyperlink w:history="1" r:id="rIdh0n24dbyv95_fbnsn4wi6">
+            <w:hyperlink w:history="1" r:id="rIdrzq3doikpctadkt_ki5p-">
               <w:r>
                 <w:rPr>
                   <w:rFonts w:ascii="Calibri" w:cs="Calibri" w:eastAsia="Calibri" w:hAnsi="Calibri"/>
@@ -1631,7 +1631,7 @@
               <w:keepNext/>
               <w:spacing w:after="0" w:line="222"/>
             </w:pPr>
-            <w:hyperlink w:history="1" r:id="rIdzdsg2mshhykxi55r8_vtu">
+            <w:hyperlink w:history="1" r:id="rIdwghktahilppekdcla2hmq">
               <w:r>
                 <w:rPr>
                   <w:rFonts w:ascii="Calibri" w:cs="Calibri" w:eastAsia="Calibri" w:hAnsi="Calibri"/>
@@ -1652,7 +1652,7 @@
               </w:rPr>
               <w:t xml:space="preserve">  ·  </w:t>
             </w:r>
-            <w:hyperlink w:history="1" r:id="rIdzqmryfsfoyn2smjymsigt">
+            <w:hyperlink w:history="1" r:id="rIdi3blbc-bui-2pajwqe_3t">
               <w:r>
                 <w:rPr>
                   <w:rFonts w:ascii="Calibri" w:cs="Calibri" w:eastAsia="Calibri" w:hAnsi="Calibri"/>
@@ -1978,7 +1978,7 @@
               <w:keepNext/>
               <w:spacing w:after="0" w:line="222"/>
             </w:pPr>
-            <w:hyperlink w:history="1" r:id="rIdoj_bgktsazofdti91qhyv">
+            <w:hyperlink w:history="1" r:id="rIdcbj-vmvjmdmwysudhvct4">
               <w:r>
                 <w:rPr>
                   <w:rFonts w:ascii="Calibri" w:cs="Calibri" w:eastAsia="Calibri" w:hAnsi="Calibri"/>
@@ -2000,7 +2000,7 @@
         <w:tc>
           <w:tcPr>
             <w:tcW w:type="dxa" w:w="2050"/>
-            <w:shd w:fill="E3F0E6" w:val="clear"/>
+            <w:shd w:fill="EDF2F4" w:val="clear"/>
             <w:tcMar>
               <w:top w:type="dxa" w:w="50"/>
               <w:left w:type="dxa" w:w="80"/>
@@ -2046,7 +2046,7 @@
         <w:tc>
           <w:tcPr>
             <w:tcW w:type="dxa" w:w="1500"/>
-            <w:shd w:fill="E3F0E6" w:val="clear"/>
+            <w:shd w:fill="EDF2F4" w:val="clear"/>
             <w:tcMar>
               <w:top w:type="dxa" w:w="50"/>
               <w:left w:type="dxa" w:w="80"/>
@@ -2075,7 +2075,7 @@
         <w:tc>
           <w:tcPr>
             <w:tcW w:type="dxa" w:w="1750"/>
-            <w:shd w:fill="E3F0E6" w:val="clear"/>
+            <w:shd w:fill="EDF2F4" w:val="clear"/>
             <w:tcMar>
               <w:top w:type="dxa" w:w="50"/>
               <w:left w:type="dxa" w:w="80"/>
@@ -2121,7 +2121,7 @@
         <w:tc>
           <w:tcPr>
             <w:tcW w:type="dxa" w:w="1500"/>
-            <w:shd w:fill="E3F0E6" w:val="clear"/>
+            <w:shd w:fill="EDF2F4" w:val="clear"/>
             <w:tcMar>
               <w:top w:type="dxa" w:w="50"/>
               <w:left w:type="dxa" w:w="80"/>
@@ -2150,7 +2150,7 @@
         <w:tc>
           <w:tcPr>
             <w:tcW w:type="dxa" w:w="1500"/>
-            <w:shd w:fill="E3F0E6" w:val="clear"/>
+            <w:shd w:fill="EDF2F4" w:val="clear"/>
             <w:tcMar>
               <w:top w:type="dxa" w:w="50"/>
               <w:left w:type="dxa" w:w="80"/>
@@ -2179,7 +2179,7 @@
         <w:tc>
           <w:tcPr>
             <w:tcW w:type="dxa" w:w="1500"/>
-            <w:shd w:fill="E3F0E6" w:val="clear"/>
+            <w:shd w:fill="EDF2F4" w:val="clear"/>
             <w:tcMar>
               <w:top w:type="dxa" w:w="50"/>
               <w:left w:type="dxa" w:w="80"/>
@@ -2208,7 +2208,7 @@
         <w:tc>
           <w:tcPr>
             <w:tcW w:type="dxa" w:w="1950"/>
-            <w:shd w:fill="E3F0E6" w:val="clear"/>
+            <w:shd w:fill="EDF2F4" w:val="clear"/>
             <w:tcMar>
               <w:top w:type="dxa" w:w="50"/>
               <w:left w:type="dxa" w:w="80"/>
@@ -2237,7 +2237,7 @@
         <w:tc>
           <w:tcPr>
             <w:tcW w:type="dxa" w:w="1450"/>
-            <w:shd w:fill="E3F0E6" w:val="clear"/>
+            <w:shd w:fill="EDF2F4" w:val="clear"/>
             <w:tcMar>
               <w:top w:type="dxa" w:w="50"/>
               <w:left w:type="dxa" w:w="80"/>
@@ -2266,20 +2266,20 @@
         <w:tc>
           <w:tcPr>
             <w:tcW w:type="dxa" w:w="2200"/>
-            <w:shd w:fill="E3F0E6" w:val="clear"/>
-            <w:tcMar>
-              <w:top w:type="dxa" w:w="50"/>
-              <w:left w:type="dxa" w:w="80"/>
-              <w:bottom w:type="dxa" w:w="50"/>
-              <w:right w:type="dxa" w:w="80"/>
-            </w:tcMar>
-          </w:tcPr>
-          <w:p>
-            <w:pPr>
-              <w:keepNext/>
-              <w:spacing w:after="0" w:line="222"/>
-            </w:pPr>
-            <w:hyperlink w:history="1" r:id="rIdmwe5b2nbwmk7gwlehfrlw">
+            <w:shd w:fill="EDF2F4" w:val="clear"/>
+            <w:tcMar>
+              <w:top w:type="dxa" w:w="50"/>
+              <w:left w:type="dxa" w:w="80"/>
+              <w:bottom w:type="dxa" w:w="50"/>
+              <w:right w:type="dxa" w:w="80"/>
+            </w:tcMar>
+          </w:tcPr>
+          <w:p>
+            <w:pPr>
+              <w:keepNext/>
+              <w:spacing w:after="0" w:line="222"/>
+            </w:pPr>
+            <w:hyperlink w:history="1" r:id="rIdlb368y5o-jvml9cnnuvcj">
               <w:r>
                 <w:rPr>
                   <w:rFonts w:ascii="Calibri" w:cs="Calibri" w:eastAsia="Calibri" w:hAnsi="Calibri"/>
@@ -2300,7 +2300,7 @@
               </w:rPr>
               <w:t xml:space="preserve">  ·  </w:t>
             </w:r>
-            <w:hyperlink w:history="1" r:id="rIdonm7trdjfatiyoudozsu-">
+            <w:hyperlink w:history="1" r:id="rIdpl1jroihfh1cx-tr6svle">
               <w:r>
                 <w:rPr>
                   <w:rFonts w:ascii="Calibri" w:cs="Calibri" w:eastAsia="Calibri" w:hAnsi="Calibri"/>
@@ -2310,6 +2310,307 @@
                   <w:u w:val="single"/>
                 </w:rPr>
                 <w:t xml:space="preserve">Thermokon</w:t>
+              </w:r>
+            </w:hyperlink>
+          </w:p>
+        </w:tc>
+      </w:tr>
+      <w:tr>
+        <w:trPr>
+          <w:cantSplit/>
+        </w:trPr>
+        <w:tc>
+          <w:tcPr>
+            <w:tcW w:type="dxa" w:w="2050"/>
+            <w:shd w:fill="E3F0E6" w:val="clear"/>
+            <w:tcMar>
+              <w:top w:type="dxa" w:w="50"/>
+              <w:left w:type="dxa" w:w="80"/>
+              <w:bottom w:type="dxa" w:w="50"/>
+              <w:right w:type="dxa" w:w="80"/>
+            </w:tcMar>
+          </w:tcPr>
+          <w:p>
+            <w:pPr>
+              <w:keepNext/>
+              <w:spacing w:after="0" w:line="222"/>
+            </w:pPr>
+            <w:r>
+              <w:rPr>
+                <w:rFonts w:ascii="Calibri" w:cs="Calibri" w:eastAsia="Calibri" w:hAnsi="Calibri"/>
+                <w:b/>
+                <w:bCs/>
+                <w:color w:val="1F2933"/>
+                <w:sz w:val="15"/>
+                <w:szCs w:val="15"/>
+              </w:rPr>
+              <w:t xml:space="preserve">7. B-meters HYDROSONIC</w:t>
+            </w:r>
+          </w:p>
+          <w:p>
+            <w:pPr>
+              <w:keepNext/>
+              <w:spacing w:after="0" w:line="222"/>
+            </w:pPr>
+            <w:r>
+              <w:rPr>
+                <w:rFonts w:ascii="Calibri" w:cs="Calibri" w:eastAsia="Calibri" w:hAnsi="Calibri"/>
+                <w:b/>
+                <w:bCs/>
+                <w:color w:val="1F2933"/>
+                <w:sz w:val="15"/>
+                <w:szCs w:val="15"/>
+              </w:rPr>
+              <w:t xml:space="preserve">Retenu, hors liste Wi6Labs</w:t>
+            </w:r>
+          </w:p>
+        </w:tc>
+        <w:tc>
+          <w:tcPr>
+            <w:tcW w:type="dxa" w:w="1500"/>
+            <w:shd w:fill="E3F0E6" w:val="clear"/>
+            <w:tcMar>
+              <w:top w:type="dxa" w:w="50"/>
+              <w:left w:type="dxa" w:w="80"/>
+              <w:bottom w:type="dxa" w:w="50"/>
+              <w:right w:type="dxa" w:w="80"/>
+            </w:tcMar>
+          </w:tcPr>
+          <w:p>
+            <w:pPr>
+              <w:keepNext/>
+              <w:spacing w:after="0" w:line="222"/>
+            </w:pPr>
+            <w:r>
+              <w:rPr>
+                <w:rFonts w:ascii="Calibri" w:cs="Calibri" w:eastAsia="Calibri" w:hAnsi="Calibri"/>
+                <w:b w:val="false"/>
+                <w:bCs w:val="false"/>
+                <w:color w:val="1F2933"/>
+                <w:sz w:val="15"/>
+                <w:szCs w:val="15"/>
+              </w:rPr>
+              <w:t xml:space="preserve">Ultrasonique</w:t>
+            </w:r>
+          </w:p>
+        </w:tc>
+        <w:tc>
+          <w:tcPr>
+            <w:tcW w:type="dxa" w:w="1750"/>
+            <w:shd w:fill="E3F0E6" w:val="clear"/>
+            <w:tcMar>
+              <w:top w:type="dxa" w:w="50"/>
+              <w:left w:type="dxa" w:w="80"/>
+              <w:bottom w:type="dxa" w:w="50"/>
+              <w:right w:type="dxa" w:w="80"/>
+            </w:tcMar>
+          </w:tcPr>
+          <w:p>
+            <w:pPr>
+              <w:keepNext/>
+              <w:spacing w:after="0" w:line="222"/>
+            </w:pPr>
+            <w:r>
+              <w:rPr>
+                <w:rFonts w:ascii="Calibri" w:cs="Calibri" w:eastAsia="Calibri" w:hAnsi="Calibri"/>
+                <w:b w:val="false"/>
+                <w:bCs w:val="false"/>
+                <w:color w:val="1F2933"/>
+                <w:sz w:val="15"/>
+                <w:szCs w:val="15"/>
+              </w:rPr>
+              <w:t xml:space="preserve">16 L/h</w:t>
+            </w:r>
+          </w:p>
+          <w:p>
+            <w:pPr>
+              <w:keepNext/>
+              <w:spacing w:after="0" w:line="222"/>
+            </w:pPr>
+            <w:r>
+              <w:rPr>
+                <w:rFonts w:ascii="Calibri" w:cs="Calibri" w:eastAsia="Calibri" w:hAnsi="Calibri"/>
+                <w:b w:val="false"/>
+                <w:bCs w:val="false"/>
+                <w:color w:val="1F2933"/>
+                <w:sz w:val="15"/>
+                <w:szCs w:val="15"/>
+              </w:rPr>
+              <w:t xml:space="preserve">(R400 ; 13 L/h en R500)</w:t>
+            </w:r>
+          </w:p>
+        </w:tc>
+        <w:tc>
+          <w:tcPr>
+            <w:tcW w:type="dxa" w:w="1500"/>
+            <w:shd w:fill="E3F0E6" w:val="clear"/>
+            <w:tcMar>
+              <w:top w:type="dxa" w:w="50"/>
+              <w:left w:type="dxa" w:w="80"/>
+              <w:bottom w:type="dxa" w:w="50"/>
+              <w:right w:type="dxa" w:w="80"/>
+            </w:tcMar>
+          </w:tcPr>
+          <w:p>
+            <w:pPr>
+              <w:keepNext/>
+              <w:spacing w:after="0" w:line="222"/>
+            </w:pPr>
+            <w:r>
+              <w:rPr>
+                <w:rFonts w:ascii="Calibri" w:cs="Calibri" w:eastAsia="Calibri" w:hAnsi="Calibri"/>
+                <w:b w:val="false"/>
+                <w:bCs w:val="false"/>
+                <w:color w:val="1F2933"/>
+                <w:sz w:val="15"/>
+                <w:szCs w:val="15"/>
+              </w:rPr>
+              <w:t xml:space="preserve">Oui</w:t>
+            </w:r>
+          </w:p>
+        </w:tc>
+        <w:tc>
+          <w:tcPr>
+            <w:tcW w:type="dxa" w:w="1500"/>
+            <w:shd w:fill="E3F0E6" w:val="clear"/>
+            <w:tcMar>
+              <w:top w:type="dxa" w:w="50"/>
+              <w:left w:type="dxa" w:w="80"/>
+              <w:bottom w:type="dxa" w:w="50"/>
+              <w:right w:type="dxa" w:w="80"/>
+            </w:tcMar>
+          </w:tcPr>
+          <w:p>
+            <w:pPr>
+              <w:keepNext/>
+              <w:spacing w:after="0" w:line="222"/>
+            </w:pPr>
+            <w:r>
+              <w:rPr>
+                <w:rFonts w:ascii="Calibri" w:cs="Calibri" w:eastAsia="Calibri" w:hAnsi="Calibri"/>
+                <w:b w:val="false"/>
+                <w:bCs w:val="false"/>
+                <w:color w:val="1F2933"/>
+                <w:sz w:val="15"/>
+                <w:szCs w:val="15"/>
+              </w:rPr>
+              <w:t xml:space="preserve">DN15 à DN40</w:t>
+            </w:r>
+          </w:p>
+        </w:tc>
+        <w:tc>
+          <w:tcPr>
+            <w:tcW w:type="dxa" w:w="1500"/>
+            <w:shd w:fill="E3F0E6" w:val="clear"/>
+            <w:tcMar>
+              <w:top w:type="dxa" w:w="50"/>
+              <w:left w:type="dxa" w:w="80"/>
+              <w:bottom w:type="dxa" w:w="50"/>
+              <w:right w:type="dxa" w:w="80"/>
+            </w:tcMar>
+          </w:tcPr>
+          <w:p>
+            <w:pPr>
+              <w:keepNext/>
+              <w:spacing w:after="0" w:line="222"/>
+            </w:pPr>
+            <w:r>
+              <w:rPr>
+                <w:rFonts w:ascii="Calibri" w:cs="Calibri" w:eastAsia="Calibri" w:hAnsi="Calibri"/>
+                <w:b w:val="false"/>
+                <w:bCs w:val="false"/>
+                <w:color w:val="1F2933"/>
+                <w:sz w:val="15"/>
+                <w:szCs w:val="15"/>
+              </w:rPr>
+              <w:t xml:space="preserve">Vidange</w:t>
+            </w:r>
+          </w:p>
+        </w:tc>
+        <w:tc>
+          <w:tcPr>
+            <w:tcW w:type="dxa" w:w="1950"/>
+            <w:shd w:fill="E3F0E6" w:val="clear"/>
+            <w:tcMar>
+              <w:top w:type="dxa" w:w="50"/>
+              <w:left w:type="dxa" w:w="80"/>
+              <w:bottom w:type="dxa" w:w="50"/>
+              <w:right w:type="dxa" w:w="80"/>
+            </w:tcMar>
+          </w:tcPr>
+          <w:p>
+            <w:pPr>
+              <w:keepNext/>
+              <w:spacing w:after="0" w:line="222"/>
+            </w:pPr>
+            <w:r>
+              <w:rPr>
+                <w:rFonts w:ascii="Calibri" w:cs="Calibri" w:eastAsia="Calibri" w:hAnsi="Calibri"/>
+                <w:b w:val="false"/>
+                <w:bCs w:val="false"/>
+                <w:color w:val="1F2933"/>
+                <w:sz w:val="15"/>
+                <w:szCs w:val="15"/>
+              </w:rPr>
+              <w:t xml:space="preserve">LoRaWAN et wM-Bus intégrés, décodeur fourni</w:t>
+            </w:r>
+          </w:p>
+        </w:tc>
+        <w:tc>
+          <w:tcPr>
+            <w:tcW w:type="dxa" w:w="1450"/>
+            <w:shd w:fill="E3F0E6" w:val="clear"/>
+            <w:tcMar>
+              <w:top w:type="dxa" w:w="50"/>
+              <w:left w:type="dxa" w:w="80"/>
+              <w:bottom w:type="dxa" w:w="50"/>
+              <w:right w:type="dxa" w:w="80"/>
+            </w:tcMar>
+          </w:tcPr>
+          <w:p>
+            <w:pPr>
+              <w:keepNext/>
+              <w:spacing w:after="0" w:line="222"/>
+            </w:pPr>
+            <w:r>
+              <w:rPr>
+                <w:rFonts w:ascii="Calibri" w:cs="Calibri" w:eastAsia="Calibri" w:hAnsi="Calibri"/>
+                <w:b w:val="false"/>
+                <w:bCs w:val="false"/>
+                <w:color w:val="1F2933"/>
+                <w:sz w:val="15"/>
+                <w:szCs w:val="15"/>
+              </w:rPr>
+              <w:t xml:space="preserve">Devis à demander</w:t>
+            </w:r>
+          </w:p>
+        </w:tc>
+        <w:tc>
+          <w:tcPr>
+            <w:tcW w:type="dxa" w:w="2200"/>
+            <w:shd w:fill="E3F0E6" w:val="clear"/>
+            <w:tcMar>
+              <w:top w:type="dxa" w:w="50"/>
+              <w:left w:type="dxa" w:w="80"/>
+              <w:bottom w:type="dxa" w:w="50"/>
+              <w:right w:type="dxa" w:w="80"/>
+            </w:tcMar>
+          </w:tcPr>
+          <w:p>
+            <w:pPr>
+              <w:keepNext/>
+              <w:spacing w:after="0" w:line="222"/>
+            </w:pPr>
+            <w:hyperlink w:history="1" r:id="rId5vunm7dy0fpzvv1e-ul4a">
+              <w:r>
+                <w:rPr>
+                  <w:rFonts w:ascii="Calibri" w:cs="Calibri" w:eastAsia="Calibri" w:hAnsi="Calibri"/>
+                  <w:color w:val="0B5563"/>
+                  <w:sz w:val="15"/>
+                  <w:szCs w:val="15"/>
+                  <w:u w:val="single"/>
+                </w:rPr>
+                <w:t xml:space="preserve">Fiche produit</w:t>
               </w:r>
             </w:hyperlink>
           </w:p>
@@ -2391,7 +2692,7 @@
         </w:rPr>
         <w:t xml:space="preserve"> : une chasse d'eau qui fuit s'écoule directement à l'égout. Ils ne remplacent donc pas le sous-comptage. Ils ne sont pas retenus à ce stade ; ils pourraient compléter le dispositif sous une canalisation en sous-plafond. </w:t>
       </w:r>
-      <w:hyperlink w:history="1" r:id="rId0umme2ckto1uogpvjv3ok">
+      <w:hyperlink w:history="1" r:id="rId4tfuqu30vg5qt9ceq9_k0">
         <w:r>
           <w:rPr>
             <w:rFonts w:ascii="Calibri" w:cs="Calibri" w:eastAsia="Calibri" w:hAnsi="Calibri"/>
@@ -2412,7 +2713,7 @@
         </w:rPr>
         <w:t xml:space="preserve">  ·  </w:t>
       </w:r>
-      <w:hyperlink w:history="1" r:id="rIdftzbqtrfj3tpfr4c8r9so">
+      <w:hyperlink w:history="1" r:id="rId6nlczlmh-wnxthfbnnn81">
         <w:r>
           <w:rPr>
             <w:rFonts w:ascii="Calibri" w:cs="Calibri" w:eastAsia="Calibri" w:hAnsi="Calibri"/>
@@ -2558,7 +2859,7 @@
         </w:rPr>
         <w:t xml:space="preserve">ultrasonique à radio LoRaWAN intégrée, R400 en standard et R500 sur demande, DN15 à DN40, pile de 13 ans, décodeur fourni par B-meters. </w:t>
       </w:r>
-      <w:hyperlink w:history="1" r:id="rIdrsvoa-8gxvwzxrxhc0b0d">
+      <w:hyperlink w:history="1" r:id="rIdetikpebzezistfayoxozv">
         <w:r>
           <w:rPr>
             <w:rFonts w:ascii="Calibri" w:cs="Calibri" w:eastAsia="Calibri" w:hAnsi="Calibri"/>

</xml_diff>

<commit_message>
Gradue la colonne des fuites du comparatif matériel
La note de lecture pose qu'un compteur ne voit de façon fiable que les
fuites supérieures à son débit minimal. Or une chasse d'eau qui fuit perd
de 6 à 25 L/h : un compteur garanti à 16 L/h n'en voit donc qu'une partie.
La colonne répondait pourtant « Oui » pour les compteurs en R400, ce qui
contredisait la note.

Chaque cellule indique désormais le seuil réel, « dès 16 L/h », « dès
8 L/h en R800 », et la conclusion parle de la plus grande partie des
fuites plutôt que de leur totalité. La note précise qu'en dessous de son
débit minimal, un compteur compte souvent encore, mais sans précision
garantie.

Co-Authored-By: Claude Opus 5.5 <noreply@anthropic.com>
Claude-Session: https://claude.ai/code/session_01DGGfCD6qThzdifW5Zpbw8C
</commit_message>
<xml_diff>
--- a/docs/Comparatif-materiel.docx
+++ b/docs/Comparatif-materiel.docx
@@ -191,7 +191,7 @@
                 <w:sz w:val="15"/>
                 <w:szCs w:val="15"/>
               </w:rPr>
-              <w:t xml:space="preserve">Voit une fuite de chasse d'eau (6 à 25 L/h)</w:t>
+              <w:t xml:space="preserve">Fuite de chasse d'eau vue de façon fiable (fuites de 6 à 25 L/h)</w:t>
             </w:r>
           </w:p>
         </w:tc>
@@ -661,7 +661,7 @@
               <w:keepNext/>
               <w:spacing w:after="0" w:line="222"/>
             </w:pPr>
-            <w:hyperlink w:history="1" r:id="rIdq1eql_ininsnpl-dr0bic">
+            <w:hyperlink w:history="1" r:id="rIdud6ri6h-jgddqxsh126lu">
               <w:r>
                 <w:rPr>
                   <w:rFonts w:ascii="Calibri" w:cs="Calibri" w:eastAsia="Calibri" w:hAnsi="Calibri"/>
@@ -682,7 +682,7 @@
               </w:rPr>
               <w:t xml:space="preserve">  ·  </w:t>
             </w:r>
-            <w:hyperlink w:history="1" r:id="rIdyqr7as2sixwjkdc49kcpm">
+            <w:hyperlink w:history="1" r:id="rIdfulmgivp-c7-btgdmfxnl">
               <w:r>
                 <w:rPr>
                   <w:rFonts w:ascii="Calibri" w:cs="Calibri" w:eastAsia="Calibri" w:hAnsi="Calibri"/>
@@ -847,7 +847,7 @@
                 <w:sz w:val="15"/>
                 <w:szCs w:val="15"/>
               </w:rPr>
-              <w:t xml:space="preserve">En limite</w:t>
+              <w:t xml:space="preserve">Seulement les plus fortes, à 25 L/h</w:t>
             </w:r>
           </w:p>
         </w:tc>
@@ -1000,7 +1000,7 @@
               <w:keepNext/>
               <w:spacing w:after="0" w:line="222"/>
             </w:pPr>
-            <w:hyperlink w:history="1" r:id="rIdybtfseq1zmccnfwoy0k8l">
+            <w:hyperlink w:history="1" r:id="rIdmfs4h1v3k_-r_nvilpdbx">
               <w:r>
                 <w:rPr>
                   <w:rFonts w:ascii="Calibri" w:cs="Calibri" w:eastAsia="Calibri" w:hAnsi="Calibri"/>
@@ -1021,7 +1021,7 @@
               </w:rPr>
               <w:t xml:space="preserve">  ·  </w:t>
             </w:r>
-            <w:hyperlink w:history="1" r:id="rIdhouxyrk-pg-plaalnz6zg">
+            <w:hyperlink w:history="1" r:id="rIdp8ibnlt5-ydhnkfwge0nt">
               <w:r>
                 <w:rPr>
                   <w:rFonts w:ascii="Calibri" w:cs="Calibri" w:eastAsia="Calibri" w:hAnsi="Calibri"/>
@@ -1182,7 +1182,24 @@
                 <w:sz w:val="15"/>
                 <w:szCs w:val="15"/>
               </w:rPr>
-              <w:t xml:space="preserve">Oui en R400 ou R800</w:t>
+              <w:t xml:space="preserve">Dès 8 L/h en R800</w:t>
+            </w:r>
+          </w:p>
+          <w:p>
+            <w:pPr>
+              <w:keepNext/>
+              <w:spacing w:after="0" w:line="222"/>
+            </w:pPr>
+            <w:r>
+              <w:rPr>
+                <w:rFonts w:ascii="Calibri" w:cs="Calibri" w:eastAsia="Calibri" w:hAnsi="Calibri"/>
+                <w:b w:val="false"/>
+                <w:bCs w:val="false"/>
+                <w:color w:val="1F2933"/>
+                <w:sz w:val="15"/>
+                <w:szCs w:val="15"/>
+              </w:rPr>
+              <w:t xml:space="preserve">Dès 16 L/h en R400</w:t>
             </w:r>
           </w:p>
         </w:tc>
@@ -1313,7 +1330,7 @@
               <w:keepNext/>
               <w:spacing w:after="0" w:line="222"/>
             </w:pPr>
-            <w:hyperlink w:history="1" r:id="rIdisqqq_o1nt_uf2khhed6y">
+            <w:hyperlink w:history="1" r:id="rIdqycaohjdvrcxe3kcykdpf">
               <w:r>
                 <w:rPr>
                   <w:rFonts w:ascii="Calibri" w:cs="Calibri" w:eastAsia="Calibri" w:hAnsi="Calibri"/>
@@ -1478,7 +1495,7 @@
                 <w:sz w:val="15"/>
                 <w:szCs w:val="15"/>
               </w:rPr>
-              <w:t xml:space="preserve">Oui dès R400</w:t>
+              <w:t xml:space="preserve">Dès 16 L/h en R400</w:t>
             </w:r>
           </w:p>
         </w:tc>
@@ -1614,7 +1631,7 @@
               <w:keepNext/>
               <w:spacing w:after="0" w:line="222"/>
             </w:pPr>
-            <w:hyperlink w:history="1" r:id="rIdsdxphev7ic62xsj1fefkr">
+            <w:hyperlink w:history="1" r:id="rIdpkn-c-onqioqwfee8nhae">
               <w:r>
                 <w:rPr>
                   <w:rFonts w:ascii="Calibri" w:cs="Calibri" w:eastAsia="Calibri" w:hAnsi="Calibri"/>
@@ -1940,7 +1957,7 @@
               <w:keepNext/>
               <w:spacing w:after="0" w:line="222"/>
             </w:pPr>
-            <w:hyperlink w:history="1" r:id="rIdxwghle1pjfmekmemgfves">
+            <w:hyperlink w:history="1" r:id="rIda_thjodf8_4rcexhl_jlz">
               <w:r>
                 <w:rPr>
                   <w:rFonts w:ascii="Calibri" w:cs="Calibri" w:eastAsia="Calibri" w:hAnsi="Calibri"/>
@@ -2105,7 +2122,7 @@
                 <w:sz w:val="15"/>
                 <w:szCs w:val="15"/>
               </w:rPr>
-              <w:t xml:space="preserve">Oui, selon le fabricant</w:t>
+              <w:t xml:space="preserve">Dès 1 à 9 L/h, selon le fabricant</w:t>
             </w:r>
           </w:p>
         </w:tc>
@@ -2241,7 +2258,7 @@
               <w:keepNext/>
               <w:spacing w:after="0" w:line="222"/>
             </w:pPr>
-            <w:hyperlink w:history="1" r:id="rIdszrbde3twmsxou8wdaxuz">
+            <w:hyperlink w:history="1" r:id="rIdugcddyg2aki6kdkclwlrn">
               <w:r>
                 <w:rPr>
                   <w:rFonts w:ascii="Calibri" w:cs="Calibri" w:eastAsia="Calibri" w:hAnsi="Calibri"/>
@@ -2262,7 +2279,7 @@
               </w:rPr>
               <w:t xml:space="preserve">  ·  </w:t>
             </w:r>
-            <w:hyperlink w:history="1" r:id="rId69t4osyvluhsi5_ua0pq6">
+            <w:hyperlink w:history="1" r:id="rIdskgsvdd1j0pgma4tosf9-">
               <w:r>
                 <w:rPr>
                   <w:rFonts w:ascii="Calibri" w:cs="Calibri" w:eastAsia="Calibri" w:hAnsi="Calibri"/>
@@ -2427,7 +2444,24 @@
                 <w:sz w:val="15"/>
                 <w:szCs w:val="15"/>
               </w:rPr>
-              <w:t xml:space="preserve">Oui</w:t>
+              <w:t xml:space="preserve">Dès 16 L/h</w:t>
+            </w:r>
+          </w:p>
+          <w:p>
+            <w:pPr>
+              <w:keepNext/>
+              <w:spacing w:after="0" w:line="222"/>
+            </w:pPr>
+            <w:r>
+              <w:rPr>
+                <w:rFonts w:ascii="Calibri" w:cs="Calibri" w:eastAsia="Calibri" w:hAnsi="Calibri"/>
+                <w:b w:val="false"/>
+                <w:bCs w:val="false"/>
+                <w:color w:val="1F2933"/>
+                <w:sz w:val="15"/>
+                <w:szCs w:val="15"/>
+              </w:rPr>
+              <w:t xml:space="preserve">Dès 13 L/h en R500</w:t>
             </w:r>
           </w:p>
         </w:tc>
@@ -2563,7 +2597,7 @@
               <w:keepNext/>
               <w:spacing w:after="0" w:line="222"/>
             </w:pPr>
-            <w:hyperlink w:history="1" r:id="rIdeq1gk5rtqhdhvhtebo9c-">
+            <w:hyperlink w:history="1" r:id="rIdxmhtp3_oaszbgv13cbxlh">
               <w:r>
                 <w:rPr>
                   <w:rFonts w:ascii="Calibri" w:cs="Calibri" w:eastAsia="Calibri" w:hAnsi="Calibri"/>
@@ -2601,7 +2635,7 @@
           <w:sz w:val="17"/>
           <w:szCs w:val="17"/>
         </w:rPr>
-        <w:t xml:space="preserve">Le débit minimal garanti est le débit Q1 = Q3/R, calculé à DN25 pour comparer sur la même base. Une chasse d'eau qui fuit perd 6 à 25 L/h selon le Centre d'information sur l'eau : un compteur dont le débit minimal est supérieur ne la voit pas de façon fiable.</w:t>
+        <w:t xml:space="preserve">Le débit minimal garanti est le débit Q1 = Q3/R, calculé à DN25 pour comparer sur la même base. Une chasse d'eau qui fuit perd 6 à 25 L/h selon le Centre d'information sur l'eau : un compteur ne voit de façon fiable que les fuites supérieures à son débit minimal. En dessous, il compte souvent encore, mais sans précision garantie.</w:t>
       </w:r>
     </w:p>
     <w:p>
@@ -2654,7 +2688,7 @@
         </w:rPr>
         <w:t xml:space="preserve"> : une chasse d'eau qui fuit s'écoule directement à l'égout. Ils ne remplacent donc pas le sous-comptage. Ils ne sont pas retenus à ce stade ; ils pourraient compléter le dispositif sous une canalisation en sous-plafond. </w:t>
       </w:r>
-      <w:hyperlink w:history="1" r:id="rIdyzishnat7tevliviiujl1">
+      <w:hyperlink w:history="1" r:id="rIdpxtshibv6cqpdgg5vcdyu">
         <w:r>
           <w:rPr>
             <w:rFonts w:ascii="Calibri" w:cs="Calibri" w:eastAsia="Calibri" w:hAnsi="Calibri"/>
@@ -2675,7 +2709,7 @@
         </w:rPr>
         <w:t xml:space="preserve">  ·  </w:t>
       </w:r>
-      <w:hyperlink w:history="1" r:id="rIdfehemm1ezelkxayortcc-">
+      <w:hyperlink w:history="1" r:id="rIdienjs_jawfczm7qckszik">
         <w:r>
           <w:rPr>
             <w:rFonts w:ascii="Calibri" w:cs="Calibri" w:eastAsia="Calibri" w:hAnsi="Calibri"/>
@@ -2821,7 +2855,7 @@
         </w:rPr>
         <w:t xml:space="preserve">à départager par les devis. Tous deux sont des compteurs ultrasoniques à radio LoRaWAN intégrée, en un seul appareil par point. </w:t>
       </w:r>
-      <w:hyperlink w:history="1" r:id="rIdr_xtry7wz48atjfmybsy3">
+      <w:hyperlink w:history="1" r:id="rIdenxb306jr81dgrr1m4q-7">
         <w:r>
           <w:rPr>
             <w:rFonts w:ascii="Calibri" w:cs="Calibri" w:eastAsia="Calibri" w:hAnsi="Calibri"/>
@@ -2842,7 +2876,7 @@
         </w:rPr>
         <w:t xml:space="preserve">  ·  </w:t>
       </w:r>
-      <w:hyperlink w:history="1" r:id="rIdnp_tgkaomukrttexngpzq">
+      <w:hyperlink w:history="1" r:id="rIdpmwbeqs9bhogplsqsorun">
         <w:r>
           <w:rPr>
             <w:rFonts w:ascii="Calibri" w:cs="Calibri" w:eastAsia="Calibri" w:hAnsi="Calibri"/>
@@ -2877,7 +2911,7 @@
           <w:sz w:val="17"/>
           <w:szCs w:val="17"/>
         </w:rPr>
-        <w:t xml:space="preserve">Avec le Diehl, ce sont les seuls compteurs du tableau dont la classe garantit la mesure d'une fuite de chasse d'eau : 16 L/h à DN25 en R400, et moins encore en classe supérieure ou en calibre DN20. Le Zenner a pour lui d'être dans la liste de Wi6Labs, de couvrir jusqu'au DN50, de publier ses décodeurs et d'annoncer 15 ans de pile. Le HYDROSONIC appartient à la gamme B-meters déjà proposée, s'arrête au DN40 et annonce 13 ans de pile. Le Diehl HYDRUS 2.0 reste en troisième choix, si Diehl confirme que les clés de chiffrement sont livrées avec les compteurs.</w:t>
+        <w:t xml:space="preserve">Avec le Diehl, ce sont les compteurs du tableau dont la classe garantit la mesure de la plus grande partie des fuites de chasse d'eau : dès 16 L/h à DN25 en R400, dès 10 L/h en calibre DN20, et moins encore en classe supérieure. Le Zenner a pour lui d'être dans la liste de Wi6Labs, de couvrir jusqu'au DN50, de publier ses décodeurs et d'annoncer 15 ans de pile. Le HYDROSONIC appartient à la gamme B-meters déjà proposée, s'arrête au DN40 et annonce 13 ans de pile. Le Diehl HYDRUS 2.0 reste en troisième choix, si Diehl confirme que les clés de chiffrement sont livrées avec les compteurs.</w:t>
       </w:r>
     </w:p>
     <w:p>

</xml_diff>

<commit_message>
Corrige une formulation inexacte de la conclusion du comparatif
La conclusion disait que les compteurs retenus mesurent « la plus grande
partie » des fuites de chasse d'eau, dès 16 L/h. Or ces fuites vont de 6
à 25 L/h : la tranche couverte en représente moins de la moitié. La
phrase dit désormais qu'ils sont ceux qui descendent le plus bas dans
cette plage, avec une mesure garantie dès 16 L/h.

Co-Authored-By: Claude Opus 5.5 <noreply@anthropic.com>
Claude-Session: https://claude.ai/code/session_01DGGfCD6qThzdifW5Zpbw8C
</commit_message>
<xml_diff>
--- a/docs/Comparatif-materiel.docx
+++ b/docs/Comparatif-materiel.docx
@@ -661,7 +661,7 @@
               <w:keepNext/>
               <w:spacing w:after="0" w:line="222"/>
             </w:pPr>
-            <w:hyperlink w:history="1" r:id="rIdud6ri6h-jgddqxsh126lu">
+            <w:hyperlink w:history="1" r:id="rIda6ihmkigxnmrnyqcgrdl6">
               <w:r>
                 <w:rPr>
                   <w:rFonts w:ascii="Calibri" w:cs="Calibri" w:eastAsia="Calibri" w:hAnsi="Calibri"/>
@@ -682,7 +682,7 @@
               </w:rPr>
               <w:t xml:space="preserve">  ·  </w:t>
             </w:r>
-            <w:hyperlink w:history="1" r:id="rIdfulmgivp-c7-btgdmfxnl">
+            <w:hyperlink w:history="1" r:id="rIdufcwvjl8ilbozrc-iocpd">
               <w:r>
                 <w:rPr>
                   <w:rFonts w:ascii="Calibri" w:cs="Calibri" w:eastAsia="Calibri" w:hAnsi="Calibri"/>
@@ -1000,7 +1000,7 @@
               <w:keepNext/>
               <w:spacing w:after="0" w:line="222"/>
             </w:pPr>
-            <w:hyperlink w:history="1" r:id="rIdmfs4h1v3k_-r_nvilpdbx">
+            <w:hyperlink w:history="1" r:id="rIdccgtmicmr4gyhkn7htsxk">
               <w:r>
                 <w:rPr>
                   <w:rFonts w:ascii="Calibri" w:cs="Calibri" w:eastAsia="Calibri" w:hAnsi="Calibri"/>
@@ -1021,7 +1021,7 @@
               </w:rPr>
               <w:t xml:space="preserve">  ·  </w:t>
             </w:r>
-            <w:hyperlink w:history="1" r:id="rIdp8ibnlt5-ydhnkfwge0nt">
+            <w:hyperlink w:history="1" r:id="rIdekoyvkjy55bkarnxbgjdv">
               <w:r>
                 <w:rPr>
                   <w:rFonts w:ascii="Calibri" w:cs="Calibri" w:eastAsia="Calibri" w:hAnsi="Calibri"/>
@@ -1330,7 +1330,7 @@
               <w:keepNext/>
               <w:spacing w:after="0" w:line="222"/>
             </w:pPr>
-            <w:hyperlink w:history="1" r:id="rIdqycaohjdvrcxe3kcykdpf">
+            <w:hyperlink w:history="1" r:id="rIdmikyp345uzn9drb-9mfgj">
               <w:r>
                 <w:rPr>
                   <w:rFonts w:ascii="Calibri" w:cs="Calibri" w:eastAsia="Calibri" w:hAnsi="Calibri"/>
@@ -1631,7 +1631,7 @@
               <w:keepNext/>
               <w:spacing w:after="0" w:line="222"/>
             </w:pPr>
-            <w:hyperlink w:history="1" r:id="rIdpkn-c-onqioqwfee8nhae">
+            <w:hyperlink w:history="1" r:id="rIdacelb7shbtvpfxj1js88b">
               <w:r>
                 <w:rPr>
                   <w:rFonts w:ascii="Calibri" w:cs="Calibri" w:eastAsia="Calibri" w:hAnsi="Calibri"/>
@@ -1957,7 +1957,7 @@
               <w:keepNext/>
               <w:spacing w:after="0" w:line="222"/>
             </w:pPr>
-            <w:hyperlink w:history="1" r:id="rIda_thjodf8_4rcexhl_jlz">
+            <w:hyperlink w:history="1" r:id="rIdwgt8cwja-apsad4ln0h7x">
               <w:r>
                 <w:rPr>
                   <w:rFonts w:ascii="Calibri" w:cs="Calibri" w:eastAsia="Calibri" w:hAnsi="Calibri"/>
@@ -2258,7 +2258,7 @@
               <w:keepNext/>
               <w:spacing w:after="0" w:line="222"/>
             </w:pPr>
-            <w:hyperlink w:history="1" r:id="rIdugcddyg2aki6kdkclwlrn">
+            <w:hyperlink w:history="1" r:id="rIdeoqfzugmc4htsrp3gdu1b">
               <w:r>
                 <w:rPr>
                   <w:rFonts w:ascii="Calibri" w:cs="Calibri" w:eastAsia="Calibri" w:hAnsi="Calibri"/>
@@ -2279,7 +2279,7 @@
               </w:rPr>
               <w:t xml:space="preserve">  ·  </w:t>
             </w:r>
-            <w:hyperlink w:history="1" r:id="rIdskgsvdd1j0pgma4tosf9-">
+            <w:hyperlink w:history="1" r:id="rIdoq5roxprs3_p38tszqu33">
               <w:r>
                 <w:rPr>
                   <w:rFonts w:ascii="Calibri" w:cs="Calibri" w:eastAsia="Calibri" w:hAnsi="Calibri"/>
@@ -2597,7 +2597,7 @@
               <w:keepNext/>
               <w:spacing w:after="0" w:line="222"/>
             </w:pPr>
-            <w:hyperlink w:history="1" r:id="rIdxmhtp3_oaszbgv13cbxlh">
+            <w:hyperlink w:history="1" r:id="rId1xlkjbkry3ydli1f1tc1n">
               <w:r>
                 <w:rPr>
                   <w:rFonts w:ascii="Calibri" w:cs="Calibri" w:eastAsia="Calibri" w:hAnsi="Calibri"/>
@@ -2688,7 +2688,7 @@
         </w:rPr>
         <w:t xml:space="preserve"> : une chasse d'eau qui fuit s'écoule directement à l'égout. Ils ne remplacent donc pas le sous-comptage. Ils ne sont pas retenus à ce stade ; ils pourraient compléter le dispositif sous une canalisation en sous-plafond. </w:t>
       </w:r>
-      <w:hyperlink w:history="1" r:id="rIdpxtshibv6cqpdgg5vcdyu">
+      <w:hyperlink w:history="1" r:id="rId6po3eyulf6dottz1s5ibu">
         <w:r>
           <w:rPr>
             <w:rFonts w:ascii="Calibri" w:cs="Calibri" w:eastAsia="Calibri" w:hAnsi="Calibri"/>
@@ -2709,7 +2709,7 @@
         </w:rPr>
         <w:t xml:space="preserve">  ·  </w:t>
       </w:r>
-      <w:hyperlink w:history="1" r:id="rIdienjs_jawfczm7qckszik">
+      <w:hyperlink w:history="1" r:id="rIdbmrqljewextuqsbq3rjkw">
         <w:r>
           <w:rPr>
             <w:rFonts w:ascii="Calibri" w:cs="Calibri" w:eastAsia="Calibri" w:hAnsi="Calibri"/>
@@ -2855,7 +2855,7 @@
         </w:rPr>
         <w:t xml:space="preserve">à départager par les devis. Tous deux sont des compteurs ultrasoniques à radio LoRaWAN intégrée, en un seul appareil par point. </w:t>
       </w:r>
-      <w:hyperlink w:history="1" r:id="rIdenxb306jr81dgrr1m4q-7">
+      <w:hyperlink w:history="1" r:id="rId_iucfn-rdht6tv9iyy3pc">
         <w:r>
           <w:rPr>
             <w:rFonts w:ascii="Calibri" w:cs="Calibri" w:eastAsia="Calibri" w:hAnsi="Calibri"/>
@@ -2876,7 +2876,7 @@
         </w:rPr>
         <w:t xml:space="preserve">  ·  </w:t>
       </w:r>
-      <w:hyperlink w:history="1" r:id="rIdpmwbeqs9bhogplsqsorun">
+      <w:hyperlink w:history="1" r:id="rId36xvnpnnyyoonum8aywn8">
         <w:r>
           <w:rPr>
             <w:rFonts w:ascii="Calibri" w:cs="Calibri" w:eastAsia="Calibri" w:hAnsi="Calibri"/>
@@ -2911,7 +2911,7 @@
           <w:sz w:val="17"/>
           <w:szCs w:val="17"/>
         </w:rPr>
-        <w:t xml:space="preserve">Avec le Diehl, ce sont les compteurs du tableau dont la classe garantit la mesure de la plus grande partie des fuites de chasse d'eau : dès 16 L/h à DN25 en R400, dès 10 L/h en calibre DN20, et moins encore en classe supérieure. Le Zenner a pour lui d'être dans la liste de Wi6Labs, de couvrir jusqu'au DN50, de publier ses décodeurs et d'annoncer 15 ans de pile. Le HYDROSONIC appartient à la gamme B-meters déjà proposée, s'arrête au DN40 et annonce 13 ans de pile. Le Diehl HYDRUS 2.0 reste en troisième choix, si Diehl confirme que les clés de chiffrement sont livrées avec les compteurs.</w:t>
+        <w:t xml:space="preserve">Avec le Diehl, ce sont les compteurs du tableau qui descendent le plus bas dans la plage des fuites de chasse d'eau, avec une mesure garantie dès 16 L/h à DN25 en R400, dès 10 L/h en calibre DN20, et moins encore en classe supérieure. Le Zenner a pour lui d'être dans la liste de Wi6Labs, de couvrir jusqu'au DN50, de publier ses décodeurs et d'annoncer 15 ans de pile. Le HYDROSONIC appartient à la gamme B-meters déjà proposée, s'arrête au DN40 et annonce 13 ans de pile. Le Diehl HYDRUS 2.0 reste en troisième choix, si Diehl confirme que les clés de chiffrement sont livrées avec les compteurs.</w:t>
       </w:r>
     </w:p>
     <w:p>

</xml_diff>

<commit_message>
Fait porter la conclusion du comparatif sur la mesure garantie
Le CubicMeter annonce une détection plus basse que les compteurs retenus,
mais sur la seule parole du fabricant. La phrase compare désormais les
compteurs sur leur mesure garantie, ce qui la rend exacte sans exception.

Co-Authored-By: Claude Opus 5.5 <noreply@anthropic.com>
Claude-Session: https://claude.ai/code/session_01DGGfCD6qThzdifW5Zpbw8C
</commit_message>
<xml_diff>
--- a/docs/Comparatif-materiel.docx
+++ b/docs/Comparatif-materiel.docx
@@ -661,7 +661,7 @@
               <w:keepNext/>
               <w:spacing w:after="0" w:line="222"/>
             </w:pPr>
-            <w:hyperlink w:history="1" r:id="rIda6ihmkigxnmrnyqcgrdl6">
+            <w:hyperlink w:history="1" r:id="rIddhswbsoixkhbrlpgmhwlu">
               <w:r>
                 <w:rPr>
                   <w:rFonts w:ascii="Calibri" w:cs="Calibri" w:eastAsia="Calibri" w:hAnsi="Calibri"/>
@@ -682,7 +682,7 @@
               </w:rPr>
               <w:t xml:space="preserve">  ·  </w:t>
             </w:r>
-            <w:hyperlink w:history="1" r:id="rIdufcwvjl8ilbozrc-iocpd">
+            <w:hyperlink w:history="1" r:id="rIdyo-triem3_teobqpatmh0">
               <w:r>
                 <w:rPr>
                   <w:rFonts w:ascii="Calibri" w:cs="Calibri" w:eastAsia="Calibri" w:hAnsi="Calibri"/>
@@ -1000,7 +1000,7 @@
               <w:keepNext/>
               <w:spacing w:after="0" w:line="222"/>
             </w:pPr>
-            <w:hyperlink w:history="1" r:id="rIdccgtmicmr4gyhkn7htsxk">
+            <w:hyperlink w:history="1" r:id="rIdhwrs0ozoliesgk2chxumg">
               <w:r>
                 <w:rPr>
                   <w:rFonts w:ascii="Calibri" w:cs="Calibri" w:eastAsia="Calibri" w:hAnsi="Calibri"/>
@@ -1021,7 +1021,7 @@
               </w:rPr>
               <w:t xml:space="preserve">  ·  </w:t>
             </w:r>
-            <w:hyperlink w:history="1" r:id="rIdekoyvkjy55bkarnxbgjdv">
+            <w:hyperlink w:history="1" r:id="rIddvbpwe98wubnoc9magnij">
               <w:r>
                 <w:rPr>
                   <w:rFonts w:ascii="Calibri" w:cs="Calibri" w:eastAsia="Calibri" w:hAnsi="Calibri"/>
@@ -1330,7 +1330,7 @@
               <w:keepNext/>
               <w:spacing w:after="0" w:line="222"/>
             </w:pPr>
-            <w:hyperlink w:history="1" r:id="rIdmikyp345uzn9drb-9mfgj">
+            <w:hyperlink w:history="1" r:id="rIdjxmmkzckra6rtmcvw2yln">
               <w:r>
                 <w:rPr>
                   <w:rFonts w:ascii="Calibri" w:cs="Calibri" w:eastAsia="Calibri" w:hAnsi="Calibri"/>
@@ -1631,7 +1631,7 @@
               <w:keepNext/>
               <w:spacing w:after="0" w:line="222"/>
             </w:pPr>
-            <w:hyperlink w:history="1" r:id="rIdacelb7shbtvpfxj1js88b">
+            <w:hyperlink w:history="1" r:id="rIdnyc4m0pgof9wf70omo0se">
               <w:r>
                 <w:rPr>
                   <w:rFonts w:ascii="Calibri" w:cs="Calibri" w:eastAsia="Calibri" w:hAnsi="Calibri"/>
@@ -1957,7 +1957,7 @@
               <w:keepNext/>
               <w:spacing w:after="0" w:line="222"/>
             </w:pPr>
-            <w:hyperlink w:history="1" r:id="rIdwgt8cwja-apsad4ln0h7x">
+            <w:hyperlink w:history="1" r:id="rIdjn_i0sthjf8zfoe6zt3dx">
               <w:r>
                 <w:rPr>
                   <w:rFonts w:ascii="Calibri" w:cs="Calibri" w:eastAsia="Calibri" w:hAnsi="Calibri"/>
@@ -2258,7 +2258,7 @@
               <w:keepNext/>
               <w:spacing w:after="0" w:line="222"/>
             </w:pPr>
-            <w:hyperlink w:history="1" r:id="rIdeoqfzugmc4htsrp3gdu1b">
+            <w:hyperlink w:history="1" r:id="rIduze66e_gy8vxul98hsr76">
               <w:r>
                 <w:rPr>
                   <w:rFonts w:ascii="Calibri" w:cs="Calibri" w:eastAsia="Calibri" w:hAnsi="Calibri"/>
@@ -2279,7 +2279,7 @@
               </w:rPr>
               <w:t xml:space="preserve">  ·  </w:t>
             </w:r>
-            <w:hyperlink w:history="1" r:id="rIdoq5roxprs3_p38tszqu33">
+            <w:hyperlink w:history="1" r:id="rIdschk67lqw7dfdyra7dshu">
               <w:r>
                 <w:rPr>
                   <w:rFonts w:ascii="Calibri" w:cs="Calibri" w:eastAsia="Calibri" w:hAnsi="Calibri"/>
@@ -2597,7 +2597,7 @@
               <w:keepNext/>
               <w:spacing w:after="0" w:line="222"/>
             </w:pPr>
-            <w:hyperlink w:history="1" r:id="rId1xlkjbkry3ydli1f1tc1n">
+            <w:hyperlink w:history="1" r:id="rIdfegk9i4gg4f_ay3qbexgj">
               <w:r>
                 <w:rPr>
                   <w:rFonts w:ascii="Calibri" w:cs="Calibri" w:eastAsia="Calibri" w:hAnsi="Calibri"/>
@@ -2688,7 +2688,7 @@
         </w:rPr>
         <w:t xml:space="preserve"> : une chasse d'eau qui fuit s'écoule directement à l'égout. Ils ne remplacent donc pas le sous-comptage. Ils ne sont pas retenus à ce stade ; ils pourraient compléter le dispositif sous une canalisation en sous-plafond. </w:t>
       </w:r>
-      <w:hyperlink w:history="1" r:id="rId6po3eyulf6dottz1s5ibu">
+      <w:hyperlink w:history="1" r:id="rId24s_bpvzqlckvbn0aatar">
         <w:r>
           <w:rPr>
             <w:rFonts w:ascii="Calibri" w:cs="Calibri" w:eastAsia="Calibri" w:hAnsi="Calibri"/>
@@ -2709,7 +2709,7 @@
         </w:rPr>
         <w:t xml:space="preserve">  ·  </w:t>
       </w:r>
-      <w:hyperlink w:history="1" r:id="rIdbmrqljewextuqsbq3rjkw">
+      <w:hyperlink w:history="1" r:id="rId5kl6yu0pbef0t0hr08ded">
         <w:r>
           <w:rPr>
             <w:rFonts w:ascii="Calibri" w:cs="Calibri" w:eastAsia="Calibri" w:hAnsi="Calibri"/>
@@ -2855,7 +2855,7 @@
         </w:rPr>
         <w:t xml:space="preserve">à départager par les devis. Tous deux sont des compteurs ultrasoniques à radio LoRaWAN intégrée, en un seul appareil par point. </w:t>
       </w:r>
-      <w:hyperlink w:history="1" r:id="rId_iucfn-rdht6tv9iyy3pc">
+      <w:hyperlink w:history="1" r:id="rIdvftiee3o6mc2qt0mxa18p">
         <w:r>
           <w:rPr>
             <w:rFonts w:ascii="Calibri" w:cs="Calibri" w:eastAsia="Calibri" w:hAnsi="Calibri"/>
@@ -2876,7 +2876,7 @@
         </w:rPr>
         <w:t xml:space="preserve">  ·  </w:t>
       </w:r>
-      <w:hyperlink w:history="1" r:id="rId36xvnpnnyyoonum8aywn8">
+      <w:hyperlink w:history="1" r:id="rIdnahrdlv6ti0gwaj1yzgut">
         <w:r>
           <w:rPr>
             <w:rFonts w:ascii="Calibri" w:cs="Calibri" w:eastAsia="Calibri" w:hAnsi="Calibri"/>
@@ -2911,7 +2911,7 @@
           <w:sz w:val="17"/>
           <w:szCs w:val="17"/>
         </w:rPr>
-        <w:t xml:space="preserve">Avec le Diehl, ce sont les compteurs du tableau qui descendent le plus bas dans la plage des fuites de chasse d'eau, avec une mesure garantie dès 16 L/h à DN25 en R400, dès 10 L/h en calibre DN20, et moins encore en classe supérieure. Le Zenner a pour lui d'être dans la liste de Wi6Labs, de couvrir jusqu'au DN50, de publier ses décodeurs et d'annoncer 15 ans de pile. Le HYDROSONIC appartient à la gamme B-meters déjà proposée, s'arrête au DN40 et annonce 13 ans de pile. Le Diehl HYDRUS 2.0 reste en troisième choix, si Diehl confirme que les clés de chiffrement sont livrées avec les compteurs.</w:t>
+        <w:t xml:space="preserve">Avec le Diehl, ce sont les compteurs du tableau dont la mesure est garantie le plus bas dans la plage des fuites de chasse d'eau : dès 16 L/h à DN25 en R400, dès 10 L/h en calibre DN20, et moins encore en classe supérieure. Le Zenner a pour lui d'être dans la liste de Wi6Labs, de couvrir jusqu'au DN50, de publier ses décodeurs et d'annoncer 15 ans de pile. Le HYDROSONIC appartient à la gamme B-meters déjà proposée, s'arrête au DN40 et annonce 13 ans de pile. Le Diehl HYDRUS 2.0 reste en troisième choix, si Diehl confirme que les clés de chiffrement sont livrées avec les compteurs.</w:t>
       </w:r>
     </w:p>
     <w:p>

</xml_diff>